<commit_message>
Updated - config for more justsus - created report - stored secret scroll
</commit_message>
<xml_diff>
--- a/shinobi-battle-report.docx
+++ b/shinobi-battle-report.docx
@@ -1693,7 +1693,7 @@
               <w:rPr>
                 <w:noProof/>
               </w:rPr>
-              <w:t>15</w:t>
+              <w:t>16</w:t>
             </w:r>
             <w:r>
               <w:rPr>
@@ -2658,18 +2658,16 @@
               <w:rPr>
                 <w:noProof/>
               </w:rPr>
-            </w:r>
-            <w:r>
-              <w:rPr>
-                <w:noProof/>
-              </w:rPr>
               <w:fldChar w:fldCharType="separate"/>
             </w:r>
             <w:r>
               <w:rPr>
-                <w:noProof/>
-              </w:rPr>
-              <w:t>25</w:t>
+                <w:b/>
+                <w:bCs/>
+                <w:noProof/>
+                <w:lang w:val="en-US"/>
+              </w:rPr>
+              <w:t>Error! Bookmark not defined.</w:t>
             </w:r>
             <w:r>
               <w:rPr>
@@ -2730,7 +2728,7 @@
               <w:rPr>
                 <w:noProof/>
               </w:rPr>
-              <w:t>26</w:t>
+              <w:t>25</w:t>
             </w:r>
             <w:r>
               <w:rPr>
@@ -2771,7 +2769,23 @@
         <w:spacing w:before="60" w:after="100"/>
       </w:pPr>
       <w:r>
-        <w:t>Shinobi Battle is a two-player, turn-based battle game inspired by the Naruto anime series and the retro Pokemon game format. Its defining innovation is that player actions are not selected from a menu; they are performed physically. Each player performs a real-world sequence of two-handed signs (mirroring the hand seals from Naruto) in front of their webcam. A computer vision pipeline recognizes the combination and maps it to an in-game jutsu or action.</w:t>
+        <w:t xml:space="preserve">Shinobi Battle is a two-player, turn-based battle game inspired by the Naruto anime series and the retro </w:t>
+      </w:r>
+      <w:proofErr w:type="spellStart"/>
+      <w:r>
+        <w:t>Pokemon</w:t>
+      </w:r>
+      <w:proofErr w:type="spellEnd"/>
+      <w:r>
+        <w:t xml:space="preserve"> game format. Its defining innovation is that player actions are not selected from a menu; they are performed physically. Each player performs a real-world sequence of two-handed signs (mirroring the hand seals from Naruto) in front of their webcam. A computer vision pipeline recognizes the combination and maps it to an in-game </w:t>
+      </w:r>
+      <w:proofErr w:type="spellStart"/>
+      <w:r>
+        <w:t>jutsu</w:t>
+      </w:r>
+      <w:proofErr w:type="spellEnd"/>
+      <w:r>
+        <w:t xml:space="preserve"> or action.</w:t>
       </w:r>
     </w:p>
     <w:p>
@@ -2787,10 +2801,23 @@
         <w:t xml:space="preserve">The game runs peer-to-peer over </w:t>
       </w:r>
       <w:r>
-        <w:t>a cloudflare</w:t>
-      </w:r>
-      <w:r>
-        <w:t xml:space="preserve"> tunnel, allowing two players on separate laptops anywhere to battle each other with zero dedicated server infrastructure. The frontend UI runs in a browser tab, built with React and Vite, communicating with a Python WebSocket backend that hosts all authoritative game logic.</w:t>
+        <w:t xml:space="preserve">a </w:t>
+      </w:r>
+      <w:proofErr w:type="spellStart"/>
+      <w:r>
+        <w:t>cloudflare</w:t>
+      </w:r>
+      <w:proofErr w:type="spellEnd"/>
+      <w:r>
+        <w:t xml:space="preserve"> tunnel, allowing two players on separate laptops anywhere to battle each other with zero dedicated server infrastructure. The frontend UI runs in a browser tab, built with React and </w:t>
+      </w:r>
+      <w:proofErr w:type="spellStart"/>
+      <w:r>
+        <w:t>Vite</w:t>
+      </w:r>
+      <w:proofErr w:type="spellEnd"/>
+      <w:r>
+        <w:t>, communicating with a Python WebSocket backend that hosts all authoritative game logic.</w:t>
       </w:r>
     </w:p>
     <w:p>
@@ -2813,7 +2840,15 @@
         <w:spacing w:before="60" w:after="100"/>
       </w:pPr>
       <w:r>
-        <w:t>This project is the final submission for Computer Vision course. The CV component is the academic core: a Convolutional Neural Network (CNN) trained from scratch to classify hand sign skeleton images derived from MediaPipe landmark data.</w:t>
+        <w:t xml:space="preserve">This project is the final submission for Computer Vision course. The CV component is the academic core: a Convolutional Neural Network (CNN) trained from scratch to classify hand sign skeleton images derived from </w:t>
+      </w:r>
+      <w:proofErr w:type="spellStart"/>
+      <w:r>
+        <w:t>MediaPipe</w:t>
+      </w:r>
+      <w:proofErr w:type="spellEnd"/>
+      <w:r>
+        <w:t xml:space="preserve"> landmark data.</w:t>
       </w:r>
     </w:p>
     <w:p>
@@ -2847,7 +2882,15 @@
         <w:t>5</w:t>
       </w:r>
       <w:r>
-        <w:t xml:space="preserve"> classes: 11 jutsu signs + Activation + Scrap + </w:t>
+        <w:t xml:space="preserve"> classes: 11 </w:t>
+      </w:r>
+      <w:proofErr w:type="spellStart"/>
+      <w:r>
+        <w:t>jutsu</w:t>
+      </w:r>
+      <w:proofErr w:type="spellEnd"/>
+      <w:r>
+        <w:t xml:space="preserve"> signs + Activation + Scrap + </w:t>
       </w:r>
       <w:r>
         <w:t xml:space="preserve">Shadow clone + </w:t>
@@ -2879,7 +2922,15 @@
         <w:spacing w:before="40" w:after="40"/>
       </w:pPr>
       <w:r>
-        <w:t>Implement a full turn-based battle engine with passive turn-start chakra regeneration, chakra mechanics, buff/debuff state, and spam dampening</w:t>
+        <w:t>Implement a full turn-based battle engine with passive turn-start chakra regeneration, chakra mechanics, buff/</w:t>
+      </w:r>
+      <w:proofErr w:type="spellStart"/>
+      <w:r>
+        <w:t>debuff</w:t>
+      </w:r>
+      <w:proofErr w:type="spellEnd"/>
+      <w:r>
+        <w:t xml:space="preserve"> state, and spam dampening</w:t>
       </w:r>
     </w:p>
     <w:p>
@@ -2892,7 +2943,15 @@
         <w:spacing w:before="40" w:after="40"/>
       </w:pPr>
       <w:r>
-        <w:t>Build a peer-to-peer multiplayer session over ngrok with authoritative server-side game state</w:t>
+        <w:t xml:space="preserve">Build a peer-to-peer multiplayer session over </w:t>
+      </w:r>
+      <w:proofErr w:type="spellStart"/>
+      <w:r>
+        <w:t>ngrok</w:t>
+      </w:r>
+      <w:proofErr w:type="spellEnd"/>
+      <w:r>
+        <w:t xml:space="preserve"> with authoritative server-side game state</w:t>
       </w:r>
     </w:p>
     <w:p>
@@ -2994,7 +3053,23 @@
         <w:spacing w:before="60" w:after="100"/>
       </w:pPr>
       <w:r>
-        <w:t>All hand signs are two-handed, performed with both hands simultaneously, mirroring how jutsu hand seals are performed in the Naruto series. The Ram sign is designated as the Activation token and is therefore removed from the playable jutsu sign pool. The total CNN vocabulary is 1</w:t>
+        <w:t xml:space="preserve">All hand signs are two-handed, performed with both hands simultaneously, mirroring how </w:t>
+      </w:r>
+      <w:proofErr w:type="spellStart"/>
+      <w:r>
+        <w:t>jutsu</w:t>
+      </w:r>
+      <w:proofErr w:type="spellEnd"/>
+      <w:r>
+        <w:t xml:space="preserve"> hand seals are performed in the Naruto series. The Ram sign is designated as the Activation token and is therefore removed from the playable </w:t>
+      </w:r>
+      <w:proofErr w:type="spellStart"/>
+      <w:r>
+        <w:t>jutsu</w:t>
+      </w:r>
+      <w:proofErr w:type="spellEnd"/>
+      <w:r>
+        <w:t xml:space="preserve"> sign pool. The total CNN vocabulary is 1</w:t>
       </w:r>
       <w:r>
         <w:t>5</w:t>
@@ -3201,12 +3276,21 @@
             </w:tcMar>
           </w:tcPr>
           <w:p>
-            <w:r>
-              <w:rPr>
-                <w:sz w:val="20"/>
-                <w:szCs w:val="20"/>
-              </w:rPr>
-              <w:t>Jutsu sign</w:t>
+            <w:proofErr w:type="spellStart"/>
+            <w:r>
+              <w:rPr>
+                <w:sz w:val="20"/>
+                <w:szCs w:val="20"/>
+              </w:rPr>
+              <w:t>Jutsu</w:t>
+            </w:r>
+            <w:proofErr w:type="spellEnd"/>
+            <w:r>
+              <w:rPr>
+                <w:sz w:val="20"/>
+                <w:szCs w:val="20"/>
+              </w:rPr>
+              <w:t xml:space="preserve"> sign</w:t>
             </w:r>
           </w:p>
         </w:tc>
@@ -3284,12 +3368,21 @@
             </w:tcMar>
           </w:tcPr>
           <w:p>
-            <w:r>
-              <w:rPr>
-                <w:sz w:val="20"/>
-                <w:szCs w:val="20"/>
-              </w:rPr>
-              <w:t>Jutsu sign</w:t>
+            <w:proofErr w:type="spellStart"/>
+            <w:r>
+              <w:rPr>
+                <w:sz w:val="20"/>
+                <w:szCs w:val="20"/>
+              </w:rPr>
+              <w:t>Jutsu</w:t>
+            </w:r>
+            <w:proofErr w:type="spellEnd"/>
+            <w:r>
+              <w:rPr>
+                <w:sz w:val="20"/>
+                <w:szCs w:val="20"/>
+              </w:rPr>
+              <w:t xml:space="preserve"> sign</w:t>
             </w:r>
           </w:p>
         </w:tc>
@@ -3367,12 +3460,21 @@
             </w:tcMar>
           </w:tcPr>
           <w:p>
-            <w:r>
-              <w:rPr>
-                <w:sz w:val="20"/>
-                <w:szCs w:val="20"/>
-              </w:rPr>
-              <w:t>Jutsu sign</w:t>
+            <w:proofErr w:type="spellStart"/>
+            <w:r>
+              <w:rPr>
+                <w:sz w:val="20"/>
+                <w:szCs w:val="20"/>
+              </w:rPr>
+              <w:t>Jutsu</w:t>
+            </w:r>
+            <w:proofErr w:type="spellEnd"/>
+            <w:r>
+              <w:rPr>
+                <w:sz w:val="20"/>
+                <w:szCs w:val="20"/>
+              </w:rPr>
+              <w:t xml:space="preserve"> sign</w:t>
             </w:r>
           </w:p>
         </w:tc>
@@ -3450,12 +3552,21 @@
             </w:tcMar>
           </w:tcPr>
           <w:p>
-            <w:r>
-              <w:rPr>
-                <w:sz w:val="20"/>
-                <w:szCs w:val="20"/>
-              </w:rPr>
-              <w:t>Jutsu sign</w:t>
+            <w:proofErr w:type="spellStart"/>
+            <w:r>
+              <w:rPr>
+                <w:sz w:val="20"/>
+                <w:szCs w:val="20"/>
+              </w:rPr>
+              <w:t>Jutsu</w:t>
+            </w:r>
+            <w:proofErr w:type="spellEnd"/>
+            <w:r>
+              <w:rPr>
+                <w:sz w:val="20"/>
+                <w:szCs w:val="20"/>
+              </w:rPr>
+              <w:t xml:space="preserve"> sign</w:t>
             </w:r>
           </w:p>
         </w:tc>
@@ -3533,12 +3644,21 @@
             </w:tcMar>
           </w:tcPr>
           <w:p>
-            <w:r>
-              <w:rPr>
-                <w:sz w:val="20"/>
-                <w:szCs w:val="20"/>
-              </w:rPr>
-              <w:t>Jutsu sign</w:t>
+            <w:proofErr w:type="spellStart"/>
+            <w:r>
+              <w:rPr>
+                <w:sz w:val="20"/>
+                <w:szCs w:val="20"/>
+              </w:rPr>
+              <w:t>Jutsu</w:t>
+            </w:r>
+            <w:proofErr w:type="spellEnd"/>
+            <w:r>
+              <w:rPr>
+                <w:sz w:val="20"/>
+                <w:szCs w:val="20"/>
+              </w:rPr>
+              <w:t xml:space="preserve"> sign</w:t>
             </w:r>
           </w:p>
         </w:tc>
@@ -3616,12 +3736,21 @@
             </w:tcMar>
           </w:tcPr>
           <w:p>
-            <w:r>
-              <w:rPr>
-                <w:sz w:val="20"/>
-                <w:szCs w:val="20"/>
-              </w:rPr>
-              <w:t>Jutsu sign</w:t>
+            <w:proofErr w:type="spellStart"/>
+            <w:r>
+              <w:rPr>
+                <w:sz w:val="20"/>
+                <w:szCs w:val="20"/>
+              </w:rPr>
+              <w:t>Jutsu</w:t>
+            </w:r>
+            <w:proofErr w:type="spellEnd"/>
+            <w:r>
+              <w:rPr>
+                <w:sz w:val="20"/>
+                <w:szCs w:val="20"/>
+              </w:rPr>
+              <w:t xml:space="preserve"> sign</w:t>
             </w:r>
           </w:p>
         </w:tc>
@@ -3699,12 +3828,21 @@
             </w:tcMar>
           </w:tcPr>
           <w:p>
-            <w:r>
-              <w:rPr>
-                <w:sz w:val="20"/>
-                <w:szCs w:val="20"/>
-              </w:rPr>
-              <w:t>Jutsu sign</w:t>
+            <w:proofErr w:type="spellStart"/>
+            <w:r>
+              <w:rPr>
+                <w:sz w:val="20"/>
+                <w:szCs w:val="20"/>
+              </w:rPr>
+              <w:t>Jutsu</w:t>
+            </w:r>
+            <w:proofErr w:type="spellEnd"/>
+            <w:r>
+              <w:rPr>
+                <w:sz w:val="20"/>
+                <w:szCs w:val="20"/>
+              </w:rPr>
+              <w:t xml:space="preserve"> sign</w:t>
             </w:r>
           </w:p>
         </w:tc>
@@ -3782,12 +3920,21 @@
             </w:tcMar>
           </w:tcPr>
           <w:p>
-            <w:r>
-              <w:rPr>
-                <w:sz w:val="20"/>
-                <w:szCs w:val="20"/>
-              </w:rPr>
-              <w:t>Jutsu sign</w:t>
+            <w:proofErr w:type="spellStart"/>
+            <w:r>
+              <w:rPr>
+                <w:sz w:val="20"/>
+                <w:szCs w:val="20"/>
+              </w:rPr>
+              <w:t>Jutsu</w:t>
+            </w:r>
+            <w:proofErr w:type="spellEnd"/>
+            <w:r>
+              <w:rPr>
+                <w:sz w:val="20"/>
+                <w:szCs w:val="20"/>
+              </w:rPr>
+              <w:t xml:space="preserve"> sign</w:t>
             </w:r>
           </w:p>
         </w:tc>
@@ -3865,12 +4012,21 @@
             </w:tcMar>
           </w:tcPr>
           <w:p>
-            <w:r>
-              <w:rPr>
-                <w:sz w:val="20"/>
-                <w:szCs w:val="20"/>
-              </w:rPr>
-              <w:t>Jutsu sign</w:t>
+            <w:proofErr w:type="spellStart"/>
+            <w:r>
+              <w:rPr>
+                <w:sz w:val="20"/>
+                <w:szCs w:val="20"/>
+              </w:rPr>
+              <w:t>Jutsu</w:t>
+            </w:r>
+            <w:proofErr w:type="spellEnd"/>
+            <w:r>
+              <w:rPr>
+                <w:sz w:val="20"/>
+                <w:szCs w:val="20"/>
+              </w:rPr>
+              <w:t xml:space="preserve"> sign</w:t>
             </w:r>
           </w:p>
         </w:tc>
@@ -3953,12 +4109,21 @@
                 <w:tab w:val="left" w:pos="4224"/>
               </w:tabs>
             </w:pPr>
-            <w:r>
-              <w:rPr>
-                <w:sz w:val="20"/>
-                <w:szCs w:val="20"/>
-              </w:rPr>
-              <w:t>Jutsu sign</w:t>
+            <w:proofErr w:type="spellStart"/>
+            <w:r>
+              <w:rPr>
+                <w:sz w:val="20"/>
+                <w:szCs w:val="20"/>
+              </w:rPr>
+              <w:t>Jutsu</w:t>
+            </w:r>
+            <w:proofErr w:type="spellEnd"/>
+            <w:r>
+              <w:rPr>
+                <w:sz w:val="20"/>
+                <w:szCs w:val="20"/>
+              </w:rPr>
+              <w:t xml:space="preserve"> sign</w:t>
             </w:r>
             <w:r>
               <w:rPr>
@@ -4043,12 +4208,21 @@
             </w:tcMar>
           </w:tcPr>
           <w:p>
-            <w:r>
-              <w:rPr>
-                <w:sz w:val="20"/>
-                <w:szCs w:val="20"/>
-              </w:rPr>
-              <w:t>Jutsu sign</w:t>
+            <w:proofErr w:type="spellStart"/>
+            <w:r>
+              <w:rPr>
+                <w:sz w:val="20"/>
+                <w:szCs w:val="20"/>
+              </w:rPr>
+              <w:t>Jutsu</w:t>
+            </w:r>
+            <w:proofErr w:type="spellEnd"/>
+            <w:r>
+              <w:rPr>
+                <w:sz w:val="20"/>
+                <w:szCs w:val="20"/>
+              </w:rPr>
+              <w:t xml:space="preserve"> sign</w:t>
             </w:r>
           </w:p>
         </w:tc>
@@ -4424,7 +4598,15 @@
         <w:spacing w:before="60" w:after="100"/>
       </w:pPr>
       <w:r>
-        <w:t>Ram is chosen as the Activation sign because it is one of the most visually distinct and widely recognized Naruto hand signs, making accidental triggering unlikely. The Scrap sign uses a crossed-wrists pose specifically because it is maximally distinct from all 11 jutsu signs and from Ram. The Unknown class is a CNN training class only and has no in-game action.</w:t>
+        <w:t xml:space="preserve">Ram is chosen as the Activation sign because it is one of the most visually distinct and widely recognized Naruto hand signs, making accidental triggering unlikely. The Scrap sign uses a crossed-wrists pose specifically because it is maximally distinct from all 11 </w:t>
+      </w:r>
+      <w:proofErr w:type="spellStart"/>
+      <w:r>
+        <w:t>jutsu</w:t>
+      </w:r>
+      <w:proofErr w:type="spellEnd"/>
+      <w:r>
+        <w:t xml:space="preserve"> signs and from Ram. The Unknown class is a CNN training class only and has no in-game action.</w:t>
       </w:r>
     </w:p>
     <w:p>
@@ -4465,7 +4647,15 @@
         <w:spacing w:before="40" w:after="40"/>
       </w:pPr>
       <w:r>
-        <w:t>Each confirmed sign from the 11 jutsu signs is appended to the ordered buffer in real time, with a brief lock-in animation and confidence flash in the private HUD</w:t>
+        <w:t xml:space="preserve">Each confirmed sign from the 11 </w:t>
+      </w:r>
+      <w:proofErr w:type="spellStart"/>
+      <w:r>
+        <w:t>jutsu</w:t>
+      </w:r>
+      <w:proofErr w:type="spellEnd"/>
+      <w:r>
+        <w:t xml:space="preserve"> signs is appended to the ordered buffer in real time, with a brief lock-in animation and confidence flash in the private HUD</w:t>
       </w:r>
     </w:p>
     <w:p>
@@ -4505,7 +4695,15 @@
         <w:spacing w:before="40" w:after="40"/>
       </w:pPr>
       <w:r>
-        <w:t>Activation Sign (Ram): finalizes the buffer and submits it to the Jutsu Lookup Engine; turn resolution begins</w:t>
+        <w:t xml:space="preserve">Activation Sign (Ram): finalizes the buffer and submits it to the </w:t>
+      </w:r>
+      <w:proofErr w:type="spellStart"/>
+      <w:r>
+        <w:t>Jutsu</w:t>
+      </w:r>
+      <w:proofErr w:type="spellEnd"/>
+      <w:r>
+        <w:t xml:space="preserve"> Lookup Engine; turn resolution begins</w:t>
       </w:r>
     </w:p>
     <w:p>
@@ -4545,7 +4743,15 @@
       </w:pPr>
       <w:bookmarkStart w:id="8" w:name="_Toc225242635"/>
       <w:r>
-        <w:t>2.3  Jutsu Lookup Engine</w:t>
+        <w:t xml:space="preserve">2.3  </w:t>
+      </w:r>
+      <w:proofErr w:type="spellStart"/>
+      <w:r>
+        <w:t>Jutsu</w:t>
+      </w:r>
+      <w:proofErr w:type="spellEnd"/>
+      <w:r>
+        <w:t xml:space="preserve"> Lookup Engine</w:t>
       </w:r>
       <w:bookmarkEnd w:id="8"/>
     </w:p>
@@ -4554,7 +4760,15 @@
         <w:spacing w:before="60" w:after="100"/>
       </w:pPr>
       <w:r>
-        <w:t>On Activation, the sequence buffer is checked against the Jutsu Registry. Three outcomes are possible:</w:t>
+        <w:t xml:space="preserve">On Activation, the sequence buffer is checked against the </w:t>
+      </w:r>
+      <w:proofErr w:type="spellStart"/>
+      <w:r>
+        <w:t>Jutsu</w:t>
+      </w:r>
+      <w:proofErr w:type="spellEnd"/>
+      <w:r>
+        <w:t xml:space="preserve"> Registry. Three outcomes are possible:</w:t>
       </w:r>
     </w:p>
     <w:p>
@@ -4572,7 +4786,15 @@
         <w:spacing w:before="40" w:after="60"/>
       </w:pPr>
       <w:r>
-        <w:t>Match Found: The corresponding jutsu fires. All stat math is applied and the action banner is shown above the caster's panel.</w:t>
+        <w:t xml:space="preserve">Match Found: The corresponding </w:t>
+      </w:r>
+      <w:proofErr w:type="spellStart"/>
+      <w:r>
+        <w:t>jutsu</w:t>
+      </w:r>
+      <w:proofErr w:type="spellEnd"/>
+      <w:r>
+        <w:t xml:space="preserve"> fires. All stat math is applied and the action banner is shown above the caster's panel.</w:t>
       </w:r>
     </w:p>
     <w:p>
@@ -4585,7 +4807,15 @@
         <w:spacing w:before="40" w:after="60"/>
       </w:pPr>
       <w:r>
-        <w:t>No Match: The sequence does not correspond to any registered jutsu. The player loses chakra proportional to the number of signs used (see Section 4.3). Turn ends.</w:t>
+        <w:t xml:space="preserve">No Match: The sequence does not correspond to any registered </w:t>
+      </w:r>
+      <w:proofErr w:type="spellStart"/>
+      <w:r>
+        <w:t>jutsu</w:t>
+      </w:r>
+      <w:proofErr w:type="spellEnd"/>
+      <w:r>
+        <w:t>. The player loses chakra proportional to the number of signs used (see Section 4.3). Turn ends.</w:t>
       </w:r>
     </w:p>
     <w:p>
@@ -4598,7 +4828,31 @@
         <w:spacing w:before="40" w:after="60"/>
       </w:pPr>
       <w:r>
-        <w:t>Insufficient Chakra: Even with a match, if the caster cannot cover the jutsu's chakra_cost_self, the jutsu fails with a not-enough-chakra banner. Turn ends with no chakra refund.</w:t>
+        <w:t xml:space="preserve">Insufficient Chakra: Even with a match, if the caster cannot cover the </w:t>
+      </w:r>
+      <w:proofErr w:type="spellStart"/>
+      <w:r>
+        <w:t>jutsu's</w:t>
+      </w:r>
+      <w:proofErr w:type="spellEnd"/>
+      <w:r>
+        <w:t xml:space="preserve"> </w:t>
+      </w:r>
+      <w:proofErr w:type="spellStart"/>
+      <w:r>
+        <w:t>chakra_cost_self</w:t>
+      </w:r>
+      <w:proofErr w:type="spellEnd"/>
+      <w:r>
+        <w:t xml:space="preserve">, the </w:t>
+      </w:r>
+      <w:proofErr w:type="spellStart"/>
+      <w:r>
+        <w:t>jutsu</w:t>
+      </w:r>
+      <w:proofErr w:type="spellEnd"/>
+      <w:r>
+        <w:t xml:space="preserve"> fails with a not-enough-chakra banner. Turn ends with no chakra refund.</w:t>
       </w:r>
     </w:p>
     <w:p>
@@ -5183,7 +5437,15 @@
         <w:spacing w:before="60" w:after="100"/>
       </w:pPr>
       <w:r>
-        <w:t>The passive +10 chakra at turn start ensures players always have some chakra coming in, making the game about smart jutsu selection rather than chakra starvation. Focus remains a meaningful action because it doubles the regeneration rate for that turn, at the cost of spending the turn doing nothing offensive or defensive.</w:t>
+        <w:t xml:space="preserve">The passive +10 chakra at turn start ensures players always have some chakra coming in, making the game about smart </w:t>
+      </w:r>
+      <w:proofErr w:type="spellStart"/>
+      <w:r>
+        <w:t>jutsu</w:t>
+      </w:r>
+      <w:proofErr w:type="spellEnd"/>
+      <w:r>
+        <w:t xml:space="preserve"> selection rather than chakra starvation. Focus remains a meaningful action because it doubles the regeneration rate for that turn, at the cost of spending the turn doing nothing offensive or defensive.</w:t>
       </w:r>
     </w:p>
     <w:p>
@@ -5196,7 +5458,23 @@
         <w:spacing w:before="60" w:after="100"/>
       </w:pPr>
       <w:r>
-        <w:t>Example: A player starts their turn with 30 chakra. They receive the passive +10, bringing them to 40. They then choose Focus, receiving another +20, ending the turn at 60 chakra.</w:t>
+        <w:t xml:space="preserve">Example: A player starts their turn with 30 </w:t>
+      </w:r>
+      <w:proofErr w:type="gramStart"/>
+      <w:r>
+        <w:t>chakra</w:t>
+      </w:r>
+      <w:proofErr w:type="gramEnd"/>
+      <w:r>
+        <w:t xml:space="preserve">. They receive the passive +10, bringing them to 40. They then choose Focus, receiving another +20, ending the turn at 60 </w:t>
+      </w:r>
+      <w:proofErr w:type="gramStart"/>
+      <w:r>
+        <w:t>chakra</w:t>
+      </w:r>
+      <w:proofErr w:type="gramEnd"/>
+      <w:r>
+        <w:t>.</w:t>
       </w:r>
     </w:p>
     <w:p>
@@ -5390,8 +5668,17 @@
                 <w:sz w:val="20"/>
                 <w:szCs w:val="20"/>
               </w:rPr>
-              <w:t>Attack Jutsu</w:t>
-            </w:r>
+              <w:t xml:space="preserve">Attack </w:t>
+            </w:r>
+            <w:proofErr w:type="spellStart"/>
+            <w:r>
+              <w:rPr>
+                <w:sz w:val="20"/>
+                <w:szCs w:val="20"/>
+              </w:rPr>
+              <w:t>Jutsu</w:t>
+            </w:r>
+            <w:proofErr w:type="spellEnd"/>
           </w:p>
         </w:tc>
         <w:tc>
@@ -5500,8 +5787,17 @@
                 <w:sz w:val="20"/>
                 <w:szCs w:val="20"/>
               </w:rPr>
-              <w:t>Buff Jutsu</w:t>
-            </w:r>
+              <w:t xml:space="preserve">Buff </w:t>
+            </w:r>
+            <w:proofErr w:type="spellStart"/>
+            <w:r>
+              <w:rPr>
+                <w:sz w:val="20"/>
+                <w:szCs w:val="20"/>
+              </w:rPr>
+              <w:t>Jutsu</w:t>
+            </w:r>
+            <w:proofErr w:type="spellEnd"/>
           </w:p>
         </w:tc>
         <w:tc>
@@ -5605,13 +5901,31 @@
             </w:tcMar>
           </w:tcPr>
           <w:p>
-            <w:r>
-              <w:rPr>
-                <w:sz w:val="20"/>
-                <w:szCs w:val="20"/>
-              </w:rPr>
-              <w:t>Debuff Jutsu</w:t>
-            </w:r>
+            <w:proofErr w:type="spellStart"/>
+            <w:r>
+              <w:rPr>
+                <w:sz w:val="20"/>
+                <w:szCs w:val="20"/>
+              </w:rPr>
+              <w:t>Debuff</w:t>
+            </w:r>
+            <w:proofErr w:type="spellEnd"/>
+            <w:r>
+              <w:rPr>
+                <w:sz w:val="20"/>
+                <w:szCs w:val="20"/>
+              </w:rPr>
+              <w:t xml:space="preserve"> </w:t>
+            </w:r>
+            <w:proofErr w:type="spellStart"/>
+            <w:r>
+              <w:rPr>
+                <w:sz w:val="20"/>
+                <w:szCs w:val="20"/>
+              </w:rPr>
+              <w:t>Jutsu</w:t>
+            </w:r>
+            <w:proofErr w:type="spellEnd"/>
           </w:p>
         </w:tc>
         <w:tc>
@@ -5691,7 +6005,23 @@
                 <w:sz w:val="20"/>
                 <w:szCs w:val="20"/>
               </w:rPr>
-              <w:t>e.g.  SEAL DISRUPTION!  (Debuff)</w:t>
+              <w:t>e.g.  SEAL DISRUPTION!  (</w:t>
+            </w:r>
+            <w:proofErr w:type="spellStart"/>
+            <w:r>
+              <w:rPr>
+                <w:sz w:val="20"/>
+                <w:szCs w:val="20"/>
+              </w:rPr>
+              <w:t>Debuff</w:t>
+            </w:r>
+            <w:proofErr w:type="spellEnd"/>
+            <w:r>
+              <w:rPr>
+                <w:sz w:val="20"/>
+                <w:szCs w:val="20"/>
+              </w:rPr>
+              <w:t>)</w:t>
             </w:r>
           </w:p>
         </w:tc>
@@ -5933,7 +6263,15 @@
       </w:pPr>
       <w:bookmarkStart w:id="13" w:name="_Toc225242640"/>
       <w:r>
-        <w:t>3.3  Jutsu Stats Schema</w:t>
+        <w:t xml:space="preserve">3.3  </w:t>
+      </w:r>
+      <w:proofErr w:type="spellStart"/>
+      <w:r>
+        <w:t>Jutsu</w:t>
+      </w:r>
+      <w:proofErr w:type="spellEnd"/>
+      <w:r>
+        <w:t xml:space="preserve"> Stats Schema</w:t>
       </w:r>
       <w:bookmarkEnd w:id="13"/>
     </w:p>
@@ -6159,6 +6497,7 @@
             </w:tcMar>
           </w:tcPr>
           <w:p>
+            <w:proofErr w:type="spellStart"/>
             <w:r>
               <w:rPr>
                 <w:sz w:val="20"/>
@@ -6166,6 +6505,7 @@
               </w:rPr>
               <w:t>sign_sequence</w:t>
             </w:r>
+            <w:proofErr w:type="spellEnd"/>
           </w:p>
         </w:tc>
         <w:tc>
@@ -6218,7 +6558,23 @@
                 <w:sz w:val="20"/>
                 <w:szCs w:val="20"/>
               </w:rPr>
-              <w:t>Ordered list of sign names (from the 11 jutsu signs) required to trigger</w:t>
+              <w:t xml:space="preserve">Ordered list of sign names (from the 11 </w:t>
+            </w:r>
+            <w:proofErr w:type="spellStart"/>
+            <w:r>
+              <w:rPr>
+                <w:sz w:val="20"/>
+                <w:szCs w:val="20"/>
+              </w:rPr>
+              <w:t>jutsu</w:t>
+            </w:r>
+            <w:proofErr w:type="spellEnd"/>
+            <w:r>
+              <w:rPr>
+                <w:sz w:val="20"/>
+                <w:szCs w:val="20"/>
+              </w:rPr>
+              <w:t xml:space="preserve"> signs) required to trigger</w:t>
             </w:r>
           </w:p>
         </w:tc>
@@ -6269,6 +6625,7 @@
             </w:tcMar>
           </w:tcPr>
           <w:p>
+            <w:proofErr w:type="spellStart"/>
             <w:r>
               <w:rPr>
                 <w:sz w:val="20"/>
@@ -6276,6 +6633,7 @@
               </w:rPr>
               <w:t>enum</w:t>
             </w:r>
+            <w:proofErr w:type="spellEnd"/>
           </w:p>
         </w:tc>
         <w:tc>
@@ -6301,8 +6659,33 @@
                 <w:sz w:val="20"/>
                 <w:szCs w:val="20"/>
               </w:rPr>
-              <w:t>attack | buff | debuff | shadow_clone</w:t>
-            </w:r>
+              <w:t xml:space="preserve">attack | buff | </w:t>
+            </w:r>
+            <w:proofErr w:type="spellStart"/>
+            <w:r>
+              <w:rPr>
+                <w:sz w:val="20"/>
+                <w:szCs w:val="20"/>
+              </w:rPr>
+              <w:t>debuff</w:t>
+            </w:r>
+            <w:proofErr w:type="spellEnd"/>
+            <w:r>
+              <w:rPr>
+                <w:sz w:val="20"/>
+                <w:szCs w:val="20"/>
+              </w:rPr>
+              <w:t xml:space="preserve"> | </w:t>
+            </w:r>
+            <w:proofErr w:type="spellStart"/>
+            <w:r>
+              <w:rPr>
+                <w:sz w:val="20"/>
+                <w:szCs w:val="20"/>
+              </w:rPr>
+              <w:t>shadow_clone</w:t>
+            </w:r>
+            <w:proofErr w:type="spellEnd"/>
           </w:p>
         </w:tc>
       </w:tr>
@@ -6325,6 +6708,7 @@
             </w:tcMar>
           </w:tcPr>
           <w:p>
+            <w:proofErr w:type="spellStart"/>
             <w:r>
               <w:rPr>
                 <w:sz w:val="20"/>
@@ -6332,6 +6716,7 @@
               </w:rPr>
               <w:t>dmg_to_enemy</w:t>
             </w:r>
+            <w:proofErr w:type="spellEnd"/>
           </w:p>
         </w:tc>
         <w:tc>
@@ -6408,6 +6793,7 @@
             </w:tcMar>
           </w:tcPr>
           <w:p>
+            <w:proofErr w:type="spellStart"/>
             <w:r>
               <w:rPr>
                 <w:sz w:val="20"/>
@@ -6415,6 +6801,7 @@
               </w:rPr>
               <w:t>dmg_to_self</w:t>
             </w:r>
+            <w:proofErr w:type="spellEnd"/>
           </w:p>
         </w:tc>
         <w:tc>
@@ -6491,6 +6878,7 @@
             </w:tcMar>
           </w:tcPr>
           <w:p>
+            <w:proofErr w:type="spellStart"/>
             <w:r>
               <w:rPr>
                 <w:sz w:val="20"/>
@@ -6498,6 +6886,7 @@
               </w:rPr>
               <w:t>chakra_cost_self</w:t>
             </w:r>
+            <w:proofErr w:type="spellEnd"/>
           </w:p>
         </w:tc>
         <w:tc>
@@ -6574,6 +6963,7 @@
             </w:tcMar>
           </w:tcPr>
           <w:p>
+            <w:proofErr w:type="spellStart"/>
             <w:r>
               <w:rPr>
                 <w:sz w:val="20"/>
@@ -6581,6 +6971,7 @@
               </w:rPr>
               <w:t>chakra_cost_enemy</w:t>
             </w:r>
+            <w:proofErr w:type="spellEnd"/>
           </w:p>
         </w:tc>
         <w:tc>
@@ -6657,6 +7048,7 @@
             </w:tcMar>
           </w:tcPr>
           <w:p>
+            <w:proofErr w:type="spellStart"/>
             <w:r>
               <w:rPr>
                 <w:sz w:val="20"/>
@@ -6664,6 +7056,7 @@
               </w:rPr>
               <w:t>miss_rate</w:t>
             </w:r>
+            <w:proofErr w:type="spellEnd"/>
           </w:p>
         </w:tc>
         <w:tc>
@@ -6716,7 +7109,23 @@
                 <w:sz w:val="20"/>
                 <w:szCs w:val="20"/>
               </w:rPr>
-              <w:t>Probability the jutsu produces no effect (chakra still consumed by caster)</w:t>
+              <w:t xml:space="preserve">Probability the </w:t>
+            </w:r>
+            <w:proofErr w:type="spellStart"/>
+            <w:r>
+              <w:rPr>
+                <w:sz w:val="20"/>
+                <w:szCs w:val="20"/>
+              </w:rPr>
+              <w:t>jutsu</w:t>
+            </w:r>
+            <w:proofErr w:type="spellEnd"/>
+            <w:r>
+              <w:rPr>
+                <w:sz w:val="20"/>
+                <w:szCs w:val="20"/>
+              </w:rPr>
+              <w:t xml:space="preserve"> produces no effect (chakra still consumed by caster)</w:t>
             </w:r>
           </w:p>
         </w:tc>
@@ -6740,6 +7149,7 @@
             </w:tcMar>
           </w:tcPr>
           <w:p>
+            <w:proofErr w:type="spellStart"/>
             <w:r>
               <w:rPr>
                 <w:sz w:val="20"/>
@@ -6747,6 +7157,7 @@
               </w:rPr>
               <w:t>buff_effect</w:t>
             </w:r>
+            <w:proofErr w:type="spellEnd"/>
           </w:p>
         </w:tc>
         <w:tc>
@@ -6767,12 +7178,21 @@
             </w:tcMar>
           </w:tcPr>
           <w:p>
-            <w:r>
-              <w:rPr>
-                <w:sz w:val="20"/>
-                <w:szCs w:val="20"/>
-              </w:rPr>
-              <w:t>dict | null</w:t>
+            <w:proofErr w:type="spellStart"/>
+            <w:r>
+              <w:rPr>
+                <w:sz w:val="20"/>
+                <w:szCs w:val="20"/>
+              </w:rPr>
+              <w:t>dict</w:t>
+            </w:r>
+            <w:proofErr w:type="spellEnd"/>
+            <w:r>
+              <w:rPr>
+                <w:sz w:val="20"/>
+                <w:szCs w:val="20"/>
+              </w:rPr>
+              <w:t xml:space="preserve"> | null</w:t>
             </w:r>
           </w:p>
         </w:tc>
@@ -6823,6 +7243,7 @@
             </w:tcMar>
           </w:tcPr>
           <w:p>
+            <w:proofErr w:type="spellStart"/>
             <w:r>
               <w:rPr>
                 <w:sz w:val="20"/>
@@ -6830,6 +7251,7 @@
               </w:rPr>
               <w:t>buff_duration</w:t>
             </w:r>
+            <w:proofErr w:type="spellEnd"/>
           </w:p>
         </w:tc>
         <w:tc>
@@ -6882,7 +7304,23 @@
                 <w:sz w:val="20"/>
                 <w:szCs w:val="20"/>
               </w:rPr>
-              <w:t>Number of turns the buff/debuff lasts; 0 = current turn only</w:t>
+              <w:t>Number of turns the buff/</w:t>
+            </w:r>
+            <w:proofErr w:type="spellStart"/>
+            <w:r>
+              <w:rPr>
+                <w:sz w:val="20"/>
+                <w:szCs w:val="20"/>
+              </w:rPr>
+              <w:t>debuff</w:t>
+            </w:r>
+            <w:proofErr w:type="spellEnd"/>
+            <w:r>
+              <w:rPr>
+                <w:sz w:val="20"/>
+                <w:szCs w:val="20"/>
+              </w:rPr>
+              <w:t xml:space="preserve"> lasts; 0 = current turn only</w:t>
             </w:r>
           </w:p>
         </w:tc>
@@ -6906,6 +7344,7 @@
             </w:tcMar>
           </w:tcPr>
           <w:p>
+            <w:proofErr w:type="spellStart"/>
             <w:r>
               <w:rPr>
                 <w:sz w:val="20"/>
@@ -6913,6 +7352,7 @@
               </w:rPr>
               <w:t>spam_count</w:t>
             </w:r>
+            <w:proofErr w:type="spellEnd"/>
           </w:p>
         </w:tc>
         <w:tc>
@@ -6961,7 +7401,23 @@
           </w:tcPr>
           <w:p>
             <w:r>
-              <w:t>Tracks consecutive uses for spam dampening; resets on any different action. Each jutsu also has a separate cooldown_turns value in config.</w:t>
+              <w:t xml:space="preserve">Tracks consecutive uses for spam dampening; resets on any different action. Each </w:t>
+            </w:r>
+            <w:proofErr w:type="spellStart"/>
+            <w:r>
+              <w:t>jutsu</w:t>
+            </w:r>
+            <w:proofErr w:type="spellEnd"/>
+            <w:r>
+              <w:t xml:space="preserve"> also has a separate </w:t>
+            </w:r>
+            <w:proofErr w:type="spellStart"/>
+            <w:r>
+              <w:t>cooldown_turns</w:t>
+            </w:r>
+            <w:proofErr w:type="spellEnd"/>
+            <w:r>
+              <w:t xml:space="preserve"> value in config.</w:t>
             </w:r>
           </w:p>
         </w:tc>
@@ -6978,7 +7434,15 @@
       </w:pPr>
       <w:bookmarkStart w:id="14" w:name="_Toc225242641"/>
       <w:r>
-        <w:t>3.4  Failed Jutsu Chakra Penalty</w:t>
+        <w:t xml:space="preserve">3.4  Failed </w:t>
+      </w:r>
+      <w:proofErr w:type="spellStart"/>
+      <w:r>
+        <w:t>Jutsu</w:t>
+      </w:r>
+      <w:proofErr w:type="spellEnd"/>
+      <w:r>
+        <w:t xml:space="preserve"> Chakra Penalty</w:t>
       </w:r>
       <w:bookmarkEnd w:id="14"/>
     </w:p>
@@ -6987,7 +7451,15 @@
         <w:spacing w:before="60" w:after="100"/>
       </w:pPr>
       <w:r>
-        <w:t>When a sign sequence does not match any registered jutsu, the caster loses chakra calculated as:</w:t>
+        <w:t xml:space="preserve">When a sign sequence does not match any registered </w:t>
+      </w:r>
+      <w:proofErr w:type="spellStart"/>
+      <w:r>
+        <w:t>jutsu</w:t>
+      </w:r>
+      <w:proofErr w:type="spellEnd"/>
+      <w:r>
+        <w:t>, the caster loses chakra calculated as:</w:t>
       </w:r>
     </w:p>
     <w:p>
@@ -7000,6 +7472,7 @@
         <w:spacing w:before="80" w:after="80"/>
         <w:ind w:left="720"/>
       </w:pPr>
+      <w:proofErr w:type="spellStart"/>
       <w:r>
         <w:rPr>
           <w:rFonts w:ascii="Courier New" w:eastAsia="Courier New" w:hAnsi="Courier New" w:cs="Courier New"/>
@@ -7007,7 +7480,37 @@
           <w:sz w:val="20"/>
           <w:szCs w:val="20"/>
         </w:rPr>
-        <w:t>chakra_loss = BASE_PENALTY + (len(sequence) x PER_SIGN_PENALTY)</w:t>
+        <w:t>chakra_loss</w:t>
+      </w:r>
+      <w:proofErr w:type="spellEnd"/>
+      <w:r>
+        <w:rPr>
+          <w:rFonts w:ascii="Courier New" w:eastAsia="Courier New" w:hAnsi="Courier New" w:cs="Courier New"/>
+          <w:color w:val="E65100"/>
+          <w:sz w:val="20"/>
+          <w:szCs w:val="20"/>
+        </w:rPr>
+        <w:t xml:space="preserve"> = BASE_PENALTY + (</w:t>
+      </w:r>
+      <w:proofErr w:type="spellStart"/>
+      <w:r>
+        <w:rPr>
+          <w:rFonts w:ascii="Courier New" w:eastAsia="Courier New" w:hAnsi="Courier New" w:cs="Courier New"/>
+          <w:color w:val="E65100"/>
+          <w:sz w:val="20"/>
+          <w:szCs w:val="20"/>
+        </w:rPr>
+        <w:t>len</w:t>
+      </w:r>
+      <w:proofErr w:type="spellEnd"/>
+      <w:r>
+        <w:rPr>
+          <w:rFonts w:ascii="Courier New" w:eastAsia="Courier New" w:hAnsi="Courier New" w:cs="Courier New"/>
+          <w:color w:val="E65100"/>
+          <w:sz w:val="20"/>
+          <w:szCs w:val="20"/>
+        </w:rPr>
+        <w:t>(sequence) x PER_SIGN_PENALTY)</w:t>
       </w:r>
     </w:p>
     <w:p>
@@ -7393,7 +7896,23 @@
                 <w:sz w:val="20"/>
                 <w:szCs w:val="20"/>
               </w:rPr>
-              <w:t>Significant; a 4-sign jutsu would be powerful if correct</w:t>
+              <w:t xml:space="preserve">Significant; a 4-sign </w:t>
+            </w:r>
+            <w:proofErr w:type="spellStart"/>
+            <w:r>
+              <w:rPr>
+                <w:sz w:val="20"/>
+                <w:szCs w:val="20"/>
+              </w:rPr>
+              <w:t>jutsu</w:t>
+            </w:r>
+            <w:proofErr w:type="spellEnd"/>
+            <w:r>
+              <w:rPr>
+                <w:sz w:val="20"/>
+                <w:szCs w:val="20"/>
+              </w:rPr>
+              <w:t xml:space="preserve"> would be powerful if correct</w:t>
             </w:r>
           </w:p>
         </w:tc>
@@ -7502,7 +8021,23 @@
         <w:spacing w:before="60" w:after="100"/>
       </w:pPr>
       <w:r>
-        <w:t>If a player uses the exact same Attack jutsu on consecutive turns, the effective dmg_to_enemy is reduced by a multiplier. Chakra costs and all other effects remain unchanged.</w:t>
+        <w:t xml:space="preserve">If a player uses the exact same Attack </w:t>
+      </w:r>
+      <w:proofErr w:type="spellStart"/>
+      <w:r>
+        <w:t>jutsu</w:t>
+      </w:r>
+      <w:proofErr w:type="spellEnd"/>
+      <w:r>
+        <w:t xml:space="preserve"> on consecutive turns, the effective </w:t>
+      </w:r>
+      <w:proofErr w:type="spellStart"/>
+      <w:r>
+        <w:t>dmg_to_enemy</w:t>
+      </w:r>
+      <w:proofErr w:type="spellEnd"/>
+      <w:r>
+        <w:t xml:space="preserve"> is reduced by a multiplier. Chakra costs and all other effects remain unchanged.</w:t>
       </w:r>
     </w:p>
     <w:p>
@@ -7562,8 +8097,20 @@
                 <w:sz w:val="20"/>
                 <w:szCs w:val="20"/>
               </w:rPr>
-              <w:t>Consecutive Uses of the Same Attack Jutsu</w:t>
-            </w:r>
+              <w:t xml:space="preserve">Consecutive Uses of the Same Attack </w:t>
+            </w:r>
+            <w:proofErr w:type="spellStart"/>
+            <w:r>
+              <w:rPr>
+                <w:b/>
+                <w:bCs/>
+                <w:color w:val="FFFFFF"/>
+                <w:sz w:val="20"/>
+                <w:szCs w:val="20"/>
+              </w:rPr>
+              <w:t>Jutsu</w:t>
+            </w:r>
+            <w:proofErr w:type="spellEnd"/>
           </w:p>
         </w:tc>
         <w:tc>
@@ -7838,7 +8385,23 @@
         <w:spacing w:before="40" w:after="40"/>
       </w:pPr>
       <w:r>
-        <w:t>The counter resets when the player uses any different action (different jutsu, Focus, Shadow Clone, Buff, or Debuff)</w:t>
+        <w:t xml:space="preserve">The counter resets when the player uses any different action (different </w:t>
+      </w:r>
+      <w:proofErr w:type="spellStart"/>
+      <w:r>
+        <w:t>jutsu</w:t>
+      </w:r>
+      <w:proofErr w:type="spellEnd"/>
+      <w:r>
+        <w:t xml:space="preserve">, Focus, Shadow Clone, Buff, or </w:t>
+      </w:r>
+      <w:proofErr w:type="spellStart"/>
+      <w:r>
+        <w:t>Debuff</w:t>
+      </w:r>
+      <w:proofErr w:type="spellEnd"/>
+      <w:r>
+        <w:t>)</w:t>
       </w:r>
     </w:p>
     <w:p>
@@ -7864,7 +8427,15 @@
         <w:spacing w:before="40" w:after="40"/>
       </w:pPr>
       <w:r>
-        <w:t>Buff, Debuff, Shadow Clone, and Focus actions are fully exempt from spam dampening</w:t>
+        <w:t xml:space="preserve">Buff, </w:t>
+      </w:r>
+      <w:proofErr w:type="spellStart"/>
+      <w:r>
+        <w:t>Debuff</w:t>
+      </w:r>
+      <w:proofErr w:type="spellEnd"/>
+      <w:r>
+        <w:t>, Shadow Clone, and Focus actions are fully exempt from spam dampening</w:t>
       </w:r>
     </w:p>
     <w:p>
@@ -7957,8 +8528,29 @@
         <w:spacing w:before="40" w:after="40"/>
       </w:pPr>
       <w:r>
-        <w:t>Effect: the opponent's very next Attack jutsu is resolved with an additional +50% miss rate, stacked additively on top of that jutsu's own base miss_rate</w:t>
-      </w:r>
+        <w:t xml:space="preserve">Effect: the opponent's very next Attack </w:t>
+      </w:r>
+      <w:proofErr w:type="spellStart"/>
+      <w:r>
+        <w:t>jutsu</w:t>
+      </w:r>
+      <w:proofErr w:type="spellEnd"/>
+      <w:r>
+        <w:t xml:space="preserve"> is resolved with an additional +50% miss rate, stacked additively on top of that </w:t>
+      </w:r>
+      <w:proofErr w:type="spellStart"/>
+      <w:r>
+        <w:t>jutsu's</w:t>
+      </w:r>
+      <w:proofErr w:type="spellEnd"/>
+      <w:r>
+        <w:t xml:space="preserve"> own base </w:t>
+      </w:r>
+      <w:proofErr w:type="spellStart"/>
+      <w:r>
+        <w:t>miss_rate</w:t>
+      </w:r>
+      <w:proofErr w:type="spellEnd"/>
     </w:p>
     <w:p>
       <w:pPr>
@@ -8010,7 +8602,15 @@
       </w:pPr>
       <w:bookmarkStart w:id="17" w:name="_Toc225242644"/>
       <w:r>
-        <w:t>3.7  Buff / Debuff System</w:t>
+        <w:t xml:space="preserve">3.7  Buff / </w:t>
+      </w:r>
+      <w:proofErr w:type="spellStart"/>
+      <w:r>
+        <w:t>Debuff</w:t>
+      </w:r>
+      <w:proofErr w:type="spellEnd"/>
+      <w:r>
+        <w:t xml:space="preserve"> System</w:t>
       </w:r>
       <w:bookmarkEnd w:id="17"/>
     </w:p>
@@ -8020,7 +8620,31 @@
       </w:pPr>
       <w:r>
         <w:lastRenderedPageBreak/>
-        <w:t>Buff and debuff jutsu inject modifier entries into the target player's active_modifiers list. All active modifiers are evaluated at action resolution time. Available modifier channels:</w:t>
+        <w:t xml:space="preserve">Buff and </w:t>
+      </w:r>
+      <w:proofErr w:type="spellStart"/>
+      <w:r>
+        <w:t>debuff</w:t>
+      </w:r>
+      <w:proofErr w:type="spellEnd"/>
+      <w:r>
+        <w:t xml:space="preserve"> </w:t>
+      </w:r>
+      <w:proofErr w:type="spellStart"/>
+      <w:r>
+        <w:t>jutsu</w:t>
+      </w:r>
+      <w:proofErr w:type="spellEnd"/>
+      <w:r>
+        <w:t xml:space="preserve"> inject modifier entries into the target player's </w:t>
+      </w:r>
+      <w:proofErr w:type="spellStart"/>
+      <w:r>
+        <w:t>active_modifiers</w:t>
+      </w:r>
+      <w:proofErr w:type="spellEnd"/>
+      <w:r>
+        <w:t xml:space="preserve"> list. All active modifiers are evaluated at action resolution time. Available modifier channels:</w:t>
       </w:r>
     </w:p>
     <w:p>
@@ -8199,6 +8823,7 @@
             </w:tcMar>
           </w:tcPr>
           <w:p>
+            <w:proofErr w:type="spellStart"/>
             <w:r>
               <w:rPr>
                 <w:sz w:val="20"/>
@@ -8206,6 +8831,7 @@
               </w:rPr>
               <w:t>atk_damage_flat</w:t>
             </w:r>
+            <w:proofErr w:type="spellEnd"/>
           </w:p>
         </w:tc>
         <w:tc>
@@ -8231,7 +8857,23 @@
                 <w:sz w:val="20"/>
                 <w:szCs w:val="20"/>
               </w:rPr>
-              <w:t>Outgoing dmg_to_enemy on all attacks</w:t>
+              <w:t xml:space="preserve">Outgoing </w:t>
+            </w:r>
+            <w:proofErr w:type="spellStart"/>
+            <w:r>
+              <w:rPr>
+                <w:sz w:val="20"/>
+                <w:szCs w:val="20"/>
+              </w:rPr>
+              <w:t>dmg_to_enemy</w:t>
+            </w:r>
+            <w:proofErr w:type="spellEnd"/>
+            <w:r>
+              <w:rPr>
+                <w:sz w:val="20"/>
+                <w:szCs w:val="20"/>
+              </w:rPr>
+              <w:t xml:space="preserve"> on all attacks</w:t>
             </w:r>
           </w:p>
         </w:tc>
@@ -8253,6 +8895,7 @@
             </w:tcMar>
           </w:tcPr>
           <w:p>
+            <w:proofErr w:type="spellStart"/>
             <w:r>
               <w:rPr>
                 <w:sz w:val="20"/>
@@ -8260,6 +8903,7 @@
               </w:rPr>
               <w:t>Self buff</w:t>
             </w:r>
+            <w:proofErr w:type="spellEnd"/>
           </w:p>
         </w:tc>
         <w:tc>
@@ -8309,6 +8953,7 @@
             </w:tcMar>
           </w:tcPr>
           <w:p>
+            <w:proofErr w:type="spellStart"/>
             <w:r>
               <w:rPr>
                 <w:sz w:val="20"/>
@@ -8316,6 +8961,7 @@
               </w:rPr>
               <w:t>incoming_damage_mult</w:t>
             </w:r>
+            <w:proofErr w:type="spellEnd"/>
           </w:p>
         </w:tc>
         <w:tc>
@@ -8341,7 +8987,23 @@
                 <w:sz w:val="20"/>
                 <w:szCs w:val="20"/>
               </w:rPr>
-              <w:t>Incoming dmg_to_enemy received</w:t>
+              <w:t xml:space="preserve">Incoming </w:t>
+            </w:r>
+            <w:proofErr w:type="spellStart"/>
+            <w:r>
+              <w:rPr>
+                <w:sz w:val="20"/>
+                <w:szCs w:val="20"/>
+              </w:rPr>
+              <w:t>dmg_to_enemy</w:t>
+            </w:r>
+            <w:proofErr w:type="spellEnd"/>
+            <w:r>
+              <w:rPr>
+                <w:sz w:val="20"/>
+                <w:szCs w:val="20"/>
+              </w:rPr>
+              <w:t xml:space="preserve"> received</w:t>
             </w:r>
           </w:p>
         </w:tc>
@@ -8363,6 +9025,7 @@
             </w:tcMar>
           </w:tcPr>
           <w:p>
+            <w:proofErr w:type="spellStart"/>
             <w:r>
               <w:rPr>
                 <w:sz w:val="20"/>
@@ -8370,6 +9033,7 @@
               </w:rPr>
               <w:t>Self buff</w:t>
             </w:r>
+            <w:proofErr w:type="spellEnd"/>
           </w:p>
         </w:tc>
         <w:tc>
@@ -8419,6 +9083,7 @@
             </w:tcMar>
           </w:tcPr>
           <w:p>
+            <w:proofErr w:type="spellStart"/>
             <w:r>
               <w:rPr>
                 <w:sz w:val="20"/>
@@ -8426,6 +9091,7 @@
               </w:rPr>
               <w:t>chakra_cost_mult</w:t>
             </w:r>
+            <w:proofErr w:type="spellEnd"/>
           </w:p>
         </w:tc>
         <w:tc>
@@ -8451,8 +9117,33 @@
                 <w:sz w:val="20"/>
                 <w:szCs w:val="20"/>
               </w:rPr>
-              <w:t>Self chakra_cost_self on all jutsu</w:t>
-            </w:r>
+              <w:t xml:space="preserve">Self </w:t>
+            </w:r>
+            <w:proofErr w:type="spellStart"/>
+            <w:r>
+              <w:rPr>
+                <w:sz w:val="20"/>
+                <w:szCs w:val="20"/>
+              </w:rPr>
+              <w:t>chakra_cost_self</w:t>
+            </w:r>
+            <w:proofErr w:type="spellEnd"/>
+            <w:r>
+              <w:rPr>
+                <w:sz w:val="20"/>
+                <w:szCs w:val="20"/>
+              </w:rPr>
+              <w:t xml:space="preserve"> on all </w:t>
+            </w:r>
+            <w:proofErr w:type="spellStart"/>
+            <w:r>
+              <w:rPr>
+                <w:sz w:val="20"/>
+                <w:szCs w:val="20"/>
+              </w:rPr>
+              <w:t>jutsu</w:t>
+            </w:r>
+            <w:proofErr w:type="spellEnd"/>
           </w:p>
         </w:tc>
         <w:tc>
@@ -8473,6 +9164,7 @@
             </w:tcMar>
           </w:tcPr>
           <w:p>
+            <w:proofErr w:type="spellStart"/>
             <w:r>
               <w:rPr>
                 <w:sz w:val="20"/>
@@ -8480,6 +9172,7 @@
               </w:rPr>
               <w:t>Self buff</w:t>
             </w:r>
+            <w:proofErr w:type="spellEnd"/>
           </w:p>
         </w:tc>
         <w:tc>
@@ -8529,6 +9222,7 @@
             </w:tcMar>
           </w:tcPr>
           <w:p>
+            <w:proofErr w:type="spellStart"/>
             <w:r>
               <w:rPr>
                 <w:sz w:val="20"/>
@@ -8536,6 +9230,7 @@
               </w:rPr>
               <w:t>enemy_chakra_drain_flat</w:t>
             </w:r>
+            <w:proofErr w:type="spellEnd"/>
           </w:p>
         </w:tc>
         <w:tc>
@@ -8561,7 +9256,23 @@
                 <w:sz w:val="20"/>
                 <w:szCs w:val="20"/>
               </w:rPr>
-              <w:t>Outgoing chakra_cost_enemy on attacks</w:t>
+              <w:t xml:space="preserve">Outgoing </w:t>
+            </w:r>
+            <w:proofErr w:type="spellStart"/>
+            <w:r>
+              <w:rPr>
+                <w:sz w:val="20"/>
+                <w:szCs w:val="20"/>
+              </w:rPr>
+              <w:t>chakra_cost_enemy</w:t>
+            </w:r>
+            <w:proofErr w:type="spellEnd"/>
+            <w:r>
+              <w:rPr>
+                <w:sz w:val="20"/>
+                <w:szCs w:val="20"/>
+              </w:rPr>
+              <w:t xml:space="preserve"> on attacks</w:t>
             </w:r>
           </w:p>
         </w:tc>
@@ -8583,13 +9294,31 @@
             </w:tcMar>
           </w:tcPr>
           <w:p>
-            <w:r>
-              <w:rPr>
-                <w:sz w:val="20"/>
-                <w:szCs w:val="20"/>
-              </w:rPr>
-              <w:t>Debuff on opp</w:t>
-            </w:r>
+            <w:proofErr w:type="spellStart"/>
+            <w:r>
+              <w:rPr>
+                <w:sz w:val="20"/>
+                <w:szCs w:val="20"/>
+              </w:rPr>
+              <w:t>Debuff</w:t>
+            </w:r>
+            <w:proofErr w:type="spellEnd"/>
+            <w:r>
+              <w:rPr>
+                <w:sz w:val="20"/>
+                <w:szCs w:val="20"/>
+              </w:rPr>
+              <w:t xml:space="preserve"> on </w:t>
+            </w:r>
+            <w:proofErr w:type="spellStart"/>
+            <w:r>
+              <w:rPr>
+                <w:sz w:val="20"/>
+                <w:szCs w:val="20"/>
+              </w:rPr>
+              <w:t>opp</w:t>
+            </w:r>
+            <w:proofErr w:type="spellEnd"/>
           </w:p>
         </w:tc>
         <w:tc>
@@ -8639,6 +9368,7 @@
             </w:tcMar>
           </w:tcPr>
           <w:p>
+            <w:proofErr w:type="spellStart"/>
             <w:r>
               <w:rPr>
                 <w:sz w:val="20"/>
@@ -8646,6 +9376,7 @@
               </w:rPr>
               <w:t>focus_regen_mult</w:t>
             </w:r>
+            <w:proofErr w:type="spellEnd"/>
           </w:p>
         </w:tc>
         <w:tc>
@@ -8693,13 +9424,31 @@
             </w:tcMar>
           </w:tcPr>
           <w:p>
-            <w:r>
-              <w:rPr>
-                <w:sz w:val="20"/>
-                <w:szCs w:val="20"/>
-              </w:rPr>
-              <w:t>Debuff on opp</w:t>
-            </w:r>
+            <w:proofErr w:type="spellStart"/>
+            <w:r>
+              <w:rPr>
+                <w:sz w:val="20"/>
+                <w:szCs w:val="20"/>
+              </w:rPr>
+              <w:t>Debuff</w:t>
+            </w:r>
+            <w:proofErr w:type="spellEnd"/>
+            <w:r>
+              <w:rPr>
+                <w:sz w:val="20"/>
+                <w:szCs w:val="20"/>
+              </w:rPr>
+              <w:t xml:space="preserve"> on </w:t>
+            </w:r>
+            <w:proofErr w:type="spellStart"/>
+            <w:r>
+              <w:rPr>
+                <w:sz w:val="20"/>
+                <w:szCs w:val="20"/>
+              </w:rPr>
+              <w:t>opp</w:t>
+            </w:r>
+            <w:proofErr w:type="spellEnd"/>
           </w:p>
         </w:tc>
         <w:tc>
@@ -8749,6 +9498,7 @@
             </w:tcMar>
           </w:tcPr>
           <w:p>
+            <w:proofErr w:type="spellStart"/>
             <w:r>
               <w:rPr>
                 <w:sz w:val="20"/>
@@ -8756,6 +9506,7 @@
               </w:rPr>
               <w:t>miss_rate_add</w:t>
             </w:r>
+            <w:proofErr w:type="spellEnd"/>
           </w:p>
         </w:tc>
         <w:tc>
@@ -8803,13 +9554,31 @@
             </w:tcMar>
           </w:tcPr>
           <w:p>
-            <w:r>
-              <w:rPr>
-                <w:sz w:val="20"/>
-                <w:szCs w:val="20"/>
-              </w:rPr>
-              <w:t>Debuff on opp</w:t>
-            </w:r>
+            <w:proofErr w:type="spellStart"/>
+            <w:r>
+              <w:rPr>
+                <w:sz w:val="20"/>
+                <w:szCs w:val="20"/>
+              </w:rPr>
+              <w:t>Debuff</w:t>
+            </w:r>
+            <w:proofErr w:type="spellEnd"/>
+            <w:r>
+              <w:rPr>
+                <w:sz w:val="20"/>
+                <w:szCs w:val="20"/>
+              </w:rPr>
+              <w:t xml:space="preserve"> on </w:t>
+            </w:r>
+            <w:proofErr w:type="spellStart"/>
+            <w:r>
+              <w:rPr>
+                <w:sz w:val="20"/>
+                <w:szCs w:val="20"/>
+              </w:rPr>
+              <w:t>opp</w:t>
+            </w:r>
+            <w:proofErr w:type="spellEnd"/>
           </w:p>
         </w:tc>
         <w:tc>
@@ -8859,6 +9628,7 @@
             </w:tcMar>
           </w:tcPr>
           <w:p>
+            <w:proofErr w:type="spellStart"/>
             <w:r>
               <w:rPr>
                 <w:sz w:val="20"/>
@@ -8866,6 +9636,7 @@
               </w:rPr>
               <w:t>turn_regen_mult</w:t>
             </w:r>
+            <w:proofErr w:type="spellEnd"/>
           </w:p>
         </w:tc>
         <w:tc>
@@ -8913,13 +9684,31 @@
             </w:tcMar>
           </w:tcPr>
           <w:p>
-            <w:r>
-              <w:rPr>
-                <w:sz w:val="20"/>
-                <w:szCs w:val="20"/>
-              </w:rPr>
-              <w:t>Debuff on opp</w:t>
-            </w:r>
+            <w:proofErr w:type="spellStart"/>
+            <w:r>
+              <w:rPr>
+                <w:sz w:val="20"/>
+                <w:szCs w:val="20"/>
+              </w:rPr>
+              <w:t>Debuff</w:t>
+            </w:r>
+            <w:proofErr w:type="spellEnd"/>
+            <w:r>
+              <w:rPr>
+                <w:sz w:val="20"/>
+                <w:szCs w:val="20"/>
+              </w:rPr>
+              <w:t xml:space="preserve"> on </w:t>
+            </w:r>
+            <w:proofErr w:type="spellStart"/>
+            <w:r>
+              <w:rPr>
+                <w:sz w:val="20"/>
+                <w:szCs w:val="20"/>
+              </w:rPr>
+              <w:t>opp</w:t>
+            </w:r>
+            <w:proofErr w:type="spellEnd"/>
           </w:p>
         </w:tc>
         <w:tc>
@@ -9052,7 +9841,23 @@
         <w:t>10</w:t>
       </w:r>
       <w:r>
-        <w:t xml:space="preserve"> chakra regen is applied (modified by turn_regen_mult if a debuff is active). Chakra is capped at Max Chakra.</w:t>
+        <w:t xml:space="preserve"> chakra regen is applied (modified by </w:t>
+      </w:r>
+      <w:proofErr w:type="spellStart"/>
+      <w:r>
+        <w:t>turn_regen_mult</w:t>
+      </w:r>
+      <w:proofErr w:type="spellEnd"/>
+      <w:r>
+        <w:t xml:space="preserve"> if a </w:t>
+      </w:r>
+      <w:proofErr w:type="spellStart"/>
+      <w:r>
+        <w:t>debuff</w:t>
+      </w:r>
+      <w:proofErr w:type="spellEnd"/>
+      <w:r>
+        <w:t xml:space="preserve"> is active). Chakra is capped at Max Chakra.</w:t>
       </w:r>
     </w:p>
     <w:p>
@@ -9090,8 +9895,13 @@
         </w:numPr>
         <w:spacing w:before="40" w:after="60"/>
       </w:pPr>
-      <w:r>
-        <w:t>Jutsu Lookup Engine checks the buffer.</w:t>
+      <w:proofErr w:type="spellStart"/>
+      <w:r>
+        <w:t>Jutsu</w:t>
+      </w:r>
+      <w:proofErr w:type="spellEnd"/>
+      <w:r>
+        <w:t xml:space="preserve"> Lookup Engine checks the buffer.</w:t>
       </w:r>
     </w:p>
     <w:p>
@@ -9117,7 +9927,23 @@
         <w:spacing w:before="40" w:after="60"/>
       </w:pPr>
       <w:r>
-        <w:t>Match: check if caster has enough chakra_cost_self. If not, jutsu fails with a not-enough-chakra banner; turn ends.</w:t>
+        <w:t xml:space="preserve">Match: check if caster has enough </w:t>
+      </w:r>
+      <w:proofErr w:type="spellStart"/>
+      <w:r>
+        <w:t>chakra_cost_self</w:t>
+      </w:r>
+      <w:proofErr w:type="spellEnd"/>
+      <w:r>
+        <w:t xml:space="preserve">. If not, </w:t>
+      </w:r>
+      <w:proofErr w:type="spellStart"/>
+      <w:r>
+        <w:t>jutsu</w:t>
+      </w:r>
+      <w:proofErr w:type="spellEnd"/>
+      <w:r>
+        <w:t xml:space="preserve"> fails with a not-enough-chakra banner; turn ends.</w:t>
       </w:r>
     </w:p>
     <w:p>
@@ -9130,7 +9956,15 @@
         <w:spacing w:before="40" w:after="60"/>
       </w:pPr>
       <w:r>
-        <w:t>Miss roll: random float compared against (jutsu.miss_rate + active additive miss modifiers). If miss, banner shows MISSED; turn ends with chakra consumed.</w:t>
+        <w:t>Miss roll: random float compared against (</w:t>
+      </w:r>
+      <w:proofErr w:type="spellStart"/>
+      <w:r>
+        <w:t>jutsu.miss_rate</w:t>
+      </w:r>
+      <w:proofErr w:type="spellEnd"/>
+      <w:r>
+        <w:t xml:space="preserve"> + active additive miss modifiers). If miss, banner shows MISSED; turn ends with chakra consumed.</w:t>
       </w:r>
     </w:p>
     <w:p>
@@ -9144,7 +9978,15 @@
       </w:pPr>
       <w:r>
         <w:lastRenderedPageBreak/>
-        <w:t>Spam dampening multiplier applied to dmg_to_enemy.</w:t>
+        <w:t xml:space="preserve">Spam dampening multiplier applied to </w:t>
+      </w:r>
+      <w:proofErr w:type="spellStart"/>
+      <w:r>
+        <w:t>dmg_to_enemy</w:t>
+      </w:r>
+      <w:proofErr w:type="spellEnd"/>
+      <w:r>
+        <w:t>.</w:t>
       </w:r>
     </w:p>
     <w:p>
@@ -9157,7 +9999,15 @@
         <w:spacing w:before="40" w:after="60"/>
       </w:pPr>
       <w:r>
-        <w:t>All stat changes applied simultaneously: HP to both parties, chakra to both parties, buff/debuff entries injected.</w:t>
+        <w:t>All stat changes applied simultaneously: HP to both parties, chakra to both parties, buff/</w:t>
+      </w:r>
+      <w:proofErr w:type="spellStart"/>
+      <w:r>
+        <w:t>debuff</w:t>
+      </w:r>
+      <w:proofErr w:type="spellEnd"/>
+      <w:r>
+        <w:t xml:space="preserve"> entries injected.</w:t>
       </w:r>
     </w:p>
     <w:p>
@@ -9214,7 +10064,15 @@
       <w:bookmarkStart w:id="19" w:name="_Toc225242646"/>
       <w:r>
         <w:lastRenderedPageBreak/>
-        <w:t>4. Sample Jutsu Registry</w:t>
+        <w:t xml:space="preserve">4. Sample </w:t>
+      </w:r>
+      <w:proofErr w:type="spellStart"/>
+      <w:r>
+        <w:t>Jutsu</w:t>
+      </w:r>
+      <w:proofErr w:type="spellEnd"/>
+      <w:r>
+        <w:t xml:space="preserve"> Registry</w:t>
       </w:r>
       <w:bookmarkEnd w:id="19"/>
     </w:p>
@@ -9283,6 +10141,7 @@
             <w:vAlign w:val="center"/>
           </w:tcPr>
           <w:p>
+            <w:proofErr w:type="spellStart"/>
             <w:r>
               <w:rPr>
                 <w:b/>
@@ -9291,29 +10150,9 @@
                 <w:sz w:val="20"/>
                 <w:szCs w:val="20"/>
               </w:rPr>
-              <w:t>Jutsu Name</w:t>
-            </w:r>
-          </w:p>
-        </w:tc>
-        <w:tc>
-          <w:tcPr>
-            <w:tcW w:w="890" w:type="dxa"/>
-            <w:tcBorders>
-              <w:top w:val="single" w:sz="1" w:space="0" w:color="CCCCCC"/>
-              <w:left w:val="single" w:sz="1" w:space="0" w:color="CCCCCC"/>
-              <w:bottom w:val="single" w:sz="1" w:space="0" w:color="CCCCCC"/>
-              <w:right w:val="single" w:sz="1" w:space="0" w:color="CCCCCC"/>
-            </w:tcBorders>
-            <w:shd w:val="clear" w:color="auto" w:fill="BF360C"/>
-            <w:tcMar>
-              <w:top w:w="80" w:type="dxa"/>
-              <w:left w:w="120" w:type="dxa"/>
-              <w:bottom w:w="80" w:type="dxa"/>
-              <w:right w:w="120" w:type="dxa"/>
-            </w:tcMar>
-            <w:vAlign w:val="center"/>
-          </w:tcPr>
-          <w:p>
+              <w:t>Jutsu</w:t>
+            </w:r>
+            <w:proofErr w:type="spellEnd"/>
             <w:r>
               <w:rPr>
                 <w:b/>
@@ -9322,13 +10161,13 @@
                 <w:sz w:val="20"/>
                 <w:szCs w:val="20"/>
               </w:rPr>
-              <w:t>Type</w:t>
-            </w:r>
-          </w:p>
-        </w:tc>
-        <w:tc>
-          <w:tcPr>
-            <w:tcW w:w="1795" w:type="dxa"/>
+              <w:t xml:space="preserve"> Name</w:t>
+            </w:r>
+          </w:p>
+        </w:tc>
+        <w:tc>
+          <w:tcPr>
+            <w:tcW w:w="890" w:type="dxa"/>
             <w:tcBorders>
               <w:top w:val="single" w:sz="1" w:space="0" w:color="CCCCCC"/>
               <w:left w:val="single" w:sz="1" w:space="0" w:color="CCCCCC"/>
@@ -9353,13 +10192,13 @@
                 <w:sz w:val="20"/>
                 <w:szCs w:val="20"/>
               </w:rPr>
-              <w:t>Sequence</w:t>
-            </w:r>
-          </w:p>
-        </w:tc>
-        <w:tc>
-          <w:tcPr>
-            <w:tcW w:w="798" w:type="dxa"/>
+              <w:t>Type</w:t>
+            </w:r>
+          </w:p>
+        </w:tc>
+        <w:tc>
+          <w:tcPr>
+            <w:tcW w:w="1795" w:type="dxa"/>
             <w:tcBorders>
               <w:top w:val="single" w:sz="1" w:space="0" w:color="CCCCCC"/>
               <w:left w:val="single" w:sz="1" w:space="0" w:color="CCCCCC"/>
@@ -9384,13 +10223,13 @@
                 <w:sz w:val="20"/>
                 <w:szCs w:val="20"/>
               </w:rPr>
-              <w:t>Dmg Enem</w:t>
-            </w:r>
-          </w:p>
-        </w:tc>
-        <w:tc>
-          <w:tcPr>
-            <w:tcW w:w="783" w:type="dxa"/>
+              <w:t>Sequence</w:t>
+            </w:r>
+          </w:p>
+        </w:tc>
+        <w:tc>
+          <w:tcPr>
+            <w:tcW w:w="798" w:type="dxa"/>
             <w:tcBorders>
               <w:top w:val="single" w:sz="1" w:space="0" w:color="CCCCCC"/>
               <w:left w:val="single" w:sz="1" w:space="0" w:color="CCCCCC"/>
@@ -9415,29 +10254,9 @@
                 <w:sz w:val="20"/>
                 <w:szCs w:val="20"/>
               </w:rPr>
-              <w:t>Dmg Self</w:t>
-            </w:r>
-          </w:p>
-        </w:tc>
-        <w:tc>
-          <w:tcPr>
-            <w:tcW w:w="895" w:type="dxa"/>
-            <w:tcBorders>
-              <w:top w:val="single" w:sz="1" w:space="0" w:color="CCCCCC"/>
-              <w:left w:val="single" w:sz="1" w:space="0" w:color="CCCCCC"/>
-              <w:bottom w:val="single" w:sz="1" w:space="0" w:color="CCCCCC"/>
-              <w:right w:val="single" w:sz="1" w:space="0" w:color="CCCCCC"/>
-            </w:tcBorders>
-            <w:shd w:val="clear" w:color="auto" w:fill="BF360C"/>
-            <w:tcMar>
-              <w:top w:w="80" w:type="dxa"/>
-              <w:left w:w="120" w:type="dxa"/>
-              <w:bottom w:w="80" w:type="dxa"/>
-              <w:right w:w="120" w:type="dxa"/>
-            </w:tcMar>
-            <w:vAlign w:val="center"/>
-          </w:tcPr>
-          <w:p>
+              <w:t xml:space="preserve">Dmg </w:t>
+            </w:r>
+            <w:proofErr w:type="spellStart"/>
             <w:r>
               <w:rPr>
                 <w:b/>
@@ -9446,13 +10265,14 @@
                 <w:sz w:val="20"/>
                 <w:szCs w:val="20"/>
               </w:rPr>
-              <w:t>Chkr Self</w:t>
-            </w:r>
-          </w:p>
-        </w:tc>
-        <w:tc>
-          <w:tcPr>
-            <w:tcW w:w="883" w:type="dxa"/>
+              <w:t>Enem</w:t>
+            </w:r>
+            <w:proofErr w:type="spellEnd"/>
+          </w:p>
+        </w:tc>
+        <w:tc>
+          <w:tcPr>
+            <w:tcW w:w="783" w:type="dxa"/>
             <w:tcBorders>
               <w:top w:val="single" w:sz="1" w:space="0" w:color="CCCCCC"/>
               <w:left w:val="single" w:sz="1" w:space="0" w:color="CCCCCC"/>
@@ -9477,13 +10297,13 @@
                 <w:sz w:val="20"/>
                 <w:szCs w:val="20"/>
               </w:rPr>
-              <w:t>Chkr Enem</w:t>
-            </w:r>
-          </w:p>
-        </w:tc>
-        <w:tc>
-          <w:tcPr>
-            <w:tcW w:w="863" w:type="dxa"/>
+              <w:t>Dmg Self</w:t>
+            </w:r>
+          </w:p>
+        </w:tc>
+        <w:tc>
+          <w:tcPr>
+            <w:tcW w:w="895" w:type="dxa"/>
             <w:tcBorders>
               <w:top w:val="single" w:sz="1" w:space="0" w:color="CCCCCC"/>
               <w:left w:val="single" w:sz="1" w:space="0" w:color="CCCCCC"/>
@@ -9500,6 +10320,7 @@
             <w:vAlign w:val="center"/>
           </w:tcPr>
           <w:p>
+            <w:proofErr w:type="spellStart"/>
             <w:r>
               <w:rPr>
                 <w:b/>
@@ -9508,29 +10329,9 @@
                 <w:sz w:val="20"/>
                 <w:szCs w:val="20"/>
               </w:rPr>
-              <w:t>Miss%</w:t>
-            </w:r>
-          </w:p>
-        </w:tc>
-        <w:tc>
-          <w:tcPr>
-            <w:tcW w:w="2805" w:type="dxa"/>
-            <w:tcBorders>
-              <w:top w:val="single" w:sz="1" w:space="0" w:color="CCCCCC"/>
-              <w:left w:val="single" w:sz="1" w:space="0" w:color="CCCCCC"/>
-              <w:bottom w:val="single" w:sz="1" w:space="0" w:color="CCCCCC"/>
-              <w:right w:val="single" w:sz="1" w:space="0" w:color="CCCCCC"/>
-            </w:tcBorders>
-            <w:shd w:val="clear" w:color="auto" w:fill="BF360C"/>
-            <w:tcMar>
-              <w:top w:w="80" w:type="dxa"/>
-              <w:left w:w="120" w:type="dxa"/>
-              <w:bottom w:w="80" w:type="dxa"/>
-              <w:right w:w="120" w:type="dxa"/>
-            </w:tcMar>
-            <w:vAlign w:val="center"/>
-          </w:tcPr>
-          <w:p>
+              <w:t>Chkr</w:t>
+            </w:r>
+            <w:proofErr w:type="spellEnd"/>
             <w:r>
               <w:rPr>
                 <w:b/>
@@ -9539,6 +10340,123 @@
                 <w:sz w:val="20"/>
                 <w:szCs w:val="20"/>
               </w:rPr>
+              <w:t xml:space="preserve"> Self</w:t>
+            </w:r>
+          </w:p>
+        </w:tc>
+        <w:tc>
+          <w:tcPr>
+            <w:tcW w:w="883" w:type="dxa"/>
+            <w:tcBorders>
+              <w:top w:val="single" w:sz="1" w:space="0" w:color="CCCCCC"/>
+              <w:left w:val="single" w:sz="1" w:space="0" w:color="CCCCCC"/>
+              <w:bottom w:val="single" w:sz="1" w:space="0" w:color="CCCCCC"/>
+              <w:right w:val="single" w:sz="1" w:space="0" w:color="CCCCCC"/>
+            </w:tcBorders>
+            <w:shd w:val="clear" w:color="auto" w:fill="BF360C"/>
+            <w:tcMar>
+              <w:top w:w="80" w:type="dxa"/>
+              <w:left w:w="120" w:type="dxa"/>
+              <w:bottom w:w="80" w:type="dxa"/>
+              <w:right w:w="120" w:type="dxa"/>
+            </w:tcMar>
+            <w:vAlign w:val="center"/>
+          </w:tcPr>
+          <w:p>
+            <w:proofErr w:type="spellStart"/>
+            <w:r>
+              <w:rPr>
+                <w:b/>
+                <w:bCs/>
+                <w:color w:val="FFFFFF"/>
+                <w:sz w:val="20"/>
+                <w:szCs w:val="20"/>
+              </w:rPr>
+              <w:t>Chkr</w:t>
+            </w:r>
+            <w:proofErr w:type="spellEnd"/>
+            <w:r>
+              <w:rPr>
+                <w:b/>
+                <w:bCs/>
+                <w:color w:val="FFFFFF"/>
+                <w:sz w:val="20"/>
+                <w:szCs w:val="20"/>
+              </w:rPr>
+              <w:t xml:space="preserve"> </w:t>
+            </w:r>
+            <w:proofErr w:type="spellStart"/>
+            <w:r>
+              <w:rPr>
+                <w:b/>
+                <w:bCs/>
+                <w:color w:val="FFFFFF"/>
+                <w:sz w:val="20"/>
+                <w:szCs w:val="20"/>
+              </w:rPr>
+              <w:t>Enem</w:t>
+            </w:r>
+            <w:proofErr w:type="spellEnd"/>
+          </w:p>
+        </w:tc>
+        <w:tc>
+          <w:tcPr>
+            <w:tcW w:w="863" w:type="dxa"/>
+            <w:tcBorders>
+              <w:top w:val="single" w:sz="1" w:space="0" w:color="CCCCCC"/>
+              <w:left w:val="single" w:sz="1" w:space="0" w:color="CCCCCC"/>
+              <w:bottom w:val="single" w:sz="1" w:space="0" w:color="CCCCCC"/>
+              <w:right w:val="single" w:sz="1" w:space="0" w:color="CCCCCC"/>
+            </w:tcBorders>
+            <w:shd w:val="clear" w:color="auto" w:fill="BF360C"/>
+            <w:tcMar>
+              <w:top w:w="80" w:type="dxa"/>
+              <w:left w:w="120" w:type="dxa"/>
+              <w:bottom w:w="80" w:type="dxa"/>
+              <w:right w:w="120" w:type="dxa"/>
+            </w:tcMar>
+            <w:vAlign w:val="center"/>
+          </w:tcPr>
+          <w:p>
+            <w:r>
+              <w:rPr>
+                <w:b/>
+                <w:bCs/>
+                <w:color w:val="FFFFFF"/>
+                <w:sz w:val="20"/>
+                <w:szCs w:val="20"/>
+              </w:rPr>
+              <w:t>Miss%</w:t>
+            </w:r>
+          </w:p>
+        </w:tc>
+        <w:tc>
+          <w:tcPr>
+            <w:tcW w:w="2805" w:type="dxa"/>
+            <w:tcBorders>
+              <w:top w:val="single" w:sz="1" w:space="0" w:color="CCCCCC"/>
+              <w:left w:val="single" w:sz="1" w:space="0" w:color="CCCCCC"/>
+              <w:bottom w:val="single" w:sz="1" w:space="0" w:color="CCCCCC"/>
+              <w:right w:val="single" w:sz="1" w:space="0" w:color="CCCCCC"/>
+            </w:tcBorders>
+            <w:shd w:val="clear" w:color="auto" w:fill="BF360C"/>
+            <w:tcMar>
+              <w:top w:w="80" w:type="dxa"/>
+              <w:left w:w="120" w:type="dxa"/>
+              <w:bottom w:w="80" w:type="dxa"/>
+              <w:right w:w="120" w:type="dxa"/>
+            </w:tcMar>
+            <w:vAlign w:val="center"/>
+          </w:tcPr>
+          <w:p>
+            <w:r>
+              <w:rPr>
+                <w:b/>
+                <w:bCs/>
+                <w:color w:val="FFFFFF"/>
+                <w:sz w:val="20"/>
+                <w:szCs w:val="20"/>
+              </w:rPr>
               <w:t>Buff / Notes</w:t>
             </w:r>
           </w:p>
@@ -9568,8 +10486,17 @@
                 <w:sz w:val="20"/>
                 <w:szCs w:val="20"/>
               </w:rPr>
-              <w:t>Fireball Jutsu</w:t>
-            </w:r>
+              <w:t xml:space="preserve">Fireball </w:t>
+            </w:r>
+            <w:proofErr w:type="spellStart"/>
+            <w:r>
+              <w:rPr>
+                <w:sz w:val="20"/>
+                <w:szCs w:val="20"/>
+              </w:rPr>
+              <w:t>Jutsu</w:t>
+            </w:r>
+            <w:proofErr w:type="spellEnd"/>
           </w:p>
         </w:tc>
         <w:tc>
@@ -11494,12 +12421,21 @@
             </w:tcMar>
           </w:tcPr>
           <w:p>
-            <w:r>
-              <w:rPr>
-                <w:sz w:val="20"/>
-                <w:szCs w:val="20"/>
-              </w:rPr>
-              <w:t>incoming_damage_mult 0.6 for 2 turns</w:t>
+            <w:proofErr w:type="spellStart"/>
+            <w:r>
+              <w:rPr>
+                <w:sz w:val="20"/>
+                <w:szCs w:val="20"/>
+              </w:rPr>
+              <w:t>incoming_damage_mult</w:t>
+            </w:r>
+            <w:proofErr w:type="spellEnd"/>
+            <w:r>
+              <w:rPr>
+                <w:sz w:val="20"/>
+                <w:szCs w:val="20"/>
+              </w:rPr>
+              <w:t xml:space="preserve"> 0.6 for 2 turns</w:t>
             </w:r>
           </w:p>
         </w:tc>
@@ -11739,12 +12675,21 @@
             </w:tcMar>
           </w:tcPr>
           <w:p>
-            <w:r>
-              <w:rPr>
-                <w:sz w:val="20"/>
-                <w:szCs w:val="20"/>
-              </w:rPr>
-              <w:t>chakra_cost_mult 0.7 for 3 turns</w:t>
+            <w:proofErr w:type="spellStart"/>
+            <w:r>
+              <w:rPr>
+                <w:sz w:val="20"/>
+                <w:szCs w:val="20"/>
+              </w:rPr>
+              <w:t>chakra_cost_mult</w:t>
+            </w:r>
+            <w:proofErr w:type="spellEnd"/>
+            <w:r>
+              <w:rPr>
+                <w:sz w:val="20"/>
+                <w:szCs w:val="20"/>
+              </w:rPr>
+              <w:t xml:space="preserve"> 0.7 for 3 turns</w:t>
             </w:r>
           </w:p>
         </w:tc>
@@ -11984,12 +12929,21 @@
             </w:tcMar>
           </w:tcPr>
           <w:p>
-            <w:r>
-              <w:rPr>
-                <w:sz w:val="20"/>
-                <w:szCs w:val="20"/>
-              </w:rPr>
-              <w:t>atk_damage_flat +8 for 2 turns</w:t>
+            <w:proofErr w:type="spellStart"/>
+            <w:r>
+              <w:rPr>
+                <w:sz w:val="20"/>
+                <w:szCs w:val="20"/>
+              </w:rPr>
+              <w:t>atk_damage_flat</w:t>
+            </w:r>
+            <w:proofErr w:type="spellEnd"/>
+            <w:r>
+              <w:rPr>
+                <w:sz w:val="20"/>
+                <w:szCs w:val="20"/>
+              </w:rPr>
+              <w:t xml:space="preserve"> +8 for 2 turns</w:t>
             </w:r>
           </w:p>
         </w:tc>
@@ -12040,6 +12994,7 @@
             </w:tcMar>
           </w:tcPr>
           <w:p>
+            <w:proofErr w:type="spellStart"/>
             <w:r>
               <w:rPr>
                 <w:sz w:val="20"/>
@@ -12047,6 +13002,7 @@
               </w:rPr>
               <w:t>Debuff</w:t>
             </w:r>
+            <w:proofErr w:type="spellEnd"/>
           </w:p>
         </w:tc>
         <w:tc>
@@ -12229,12 +13185,21 @@
             </w:tcMar>
           </w:tcPr>
           <w:p>
-            <w:r>
-              <w:rPr>
-                <w:sz w:val="20"/>
-                <w:szCs w:val="20"/>
-              </w:rPr>
-              <w:t>focus_regen_mult 0.4 on opponent for 3 turns</w:t>
+            <w:proofErr w:type="spellStart"/>
+            <w:r>
+              <w:rPr>
+                <w:sz w:val="20"/>
+                <w:szCs w:val="20"/>
+              </w:rPr>
+              <w:t>focus_regen_mult</w:t>
+            </w:r>
+            <w:proofErr w:type="spellEnd"/>
+            <w:r>
+              <w:rPr>
+                <w:sz w:val="20"/>
+                <w:szCs w:val="20"/>
+              </w:rPr>
+              <w:t xml:space="preserve"> 0.4 on opponent for 3 turns</w:t>
             </w:r>
           </w:p>
         </w:tc>
@@ -12285,6 +13250,7 @@
             </w:tcMar>
           </w:tcPr>
           <w:p>
+            <w:proofErr w:type="spellStart"/>
             <w:r>
               <w:rPr>
                 <w:sz w:val="20"/>
@@ -12292,6 +13258,7 @@
               </w:rPr>
               <w:t>Debuff</w:t>
             </w:r>
+            <w:proofErr w:type="spellEnd"/>
           </w:p>
         </w:tc>
         <w:tc>
@@ -12474,12 +13441,21 @@
             </w:tcMar>
           </w:tcPr>
           <w:p>
-            <w:r>
-              <w:rPr>
-                <w:sz w:val="20"/>
-                <w:szCs w:val="20"/>
-              </w:rPr>
-              <w:t>miss_rate_add +0.30 on opponent for 2 turns</w:t>
+            <w:proofErr w:type="spellStart"/>
+            <w:r>
+              <w:rPr>
+                <w:sz w:val="20"/>
+                <w:szCs w:val="20"/>
+              </w:rPr>
+              <w:t>miss_rate_add</w:t>
+            </w:r>
+            <w:proofErr w:type="spellEnd"/>
+            <w:r>
+              <w:rPr>
+                <w:sz w:val="20"/>
+                <w:szCs w:val="20"/>
+              </w:rPr>
+              <w:t xml:space="preserve"> +0.30 on opponent for 2 turns</w:t>
             </w:r>
           </w:p>
         </w:tc>
@@ -12530,6 +13506,7 @@
             </w:tcMar>
           </w:tcPr>
           <w:p>
+            <w:proofErr w:type="spellStart"/>
             <w:r>
               <w:rPr>
                 <w:sz w:val="20"/>
@@ -12537,6 +13514,7 @@
               </w:rPr>
               <w:t>Debuff</w:t>
             </w:r>
+            <w:proofErr w:type="spellEnd"/>
           </w:p>
         </w:tc>
         <w:tc>
@@ -12719,12 +13697,21 @@
             </w:tcMar>
           </w:tcPr>
           <w:p>
-            <w:r>
-              <w:rPr>
-                <w:sz w:val="20"/>
-                <w:szCs w:val="20"/>
-              </w:rPr>
-              <w:t>enemy_chakra_drain_flat +15 on opponent for 2 turns</w:t>
+            <w:proofErr w:type="spellStart"/>
+            <w:r>
+              <w:rPr>
+                <w:sz w:val="20"/>
+                <w:szCs w:val="20"/>
+              </w:rPr>
+              <w:t>enemy_chakra_drain_flat</w:t>
+            </w:r>
+            <w:proofErr w:type="spellEnd"/>
+            <w:r>
+              <w:rPr>
+                <w:sz w:val="20"/>
+                <w:szCs w:val="20"/>
+              </w:rPr>
+              <w:t xml:space="preserve"> +15 on opponent for 2 turns</w:t>
             </w:r>
           </w:p>
         </w:tc>
@@ -12775,6 +13762,7 @@
             </w:tcMar>
           </w:tcPr>
           <w:p>
+            <w:proofErr w:type="spellStart"/>
             <w:r>
               <w:rPr>
                 <w:sz w:val="20"/>
@@ -12782,6 +13770,7 @@
               </w:rPr>
               <w:t>Debuff</w:t>
             </w:r>
+            <w:proofErr w:type="spellEnd"/>
           </w:p>
         </w:tc>
         <w:tc>
@@ -12964,12 +13953,21 @@
             </w:tcMar>
           </w:tcPr>
           <w:p>
-            <w:r>
-              <w:rPr>
-                <w:sz w:val="20"/>
-                <w:szCs w:val="20"/>
-              </w:rPr>
-              <w:t>turn_regen_mult 0.5 on opponent for 3 turns (halves passive regen)</w:t>
+            <w:proofErr w:type="spellStart"/>
+            <w:r>
+              <w:rPr>
+                <w:sz w:val="20"/>
+                <w:szCs w:val="20"/>
+              </w:rPr>
+              <w:t>turn_regen_mult</w:t>
+            </w:r>
+            <w:proofErr w:type="spellEnd"/>
+            <w:r>
+              <w:rPr>
+                <w:sz w:val="20"/>
+                <w:szCs w:val="20"/>
+              </w:rPr>
+              <w:t xml:space="preserve"> 0.5 on opponent for 3 turns (halves passive regen)</w:t>
             </w:r>
           </w:p>
         </w:tc>
@@ -13214,7 +14212,23 @@
                 <w:sz w:val="20"/>
                 <w:szCs w:val="20"/>
               </w:rPr>
-              <w:t>Next opp attack +50% miss</w:t>
+              <w:t xml:space="preserve">Next </w:t>
+            </w:r>
+            <w:proofErr w:type="spellStart"/>
+            <w:r>
+              <w:rPr>
+                <w:sz w:val="20"/>
+                <w:szCs w:val="20"/>
+              </w:rPr>
+              <w:t>opp</w:t>
+            </w:r>
+            <w:proofErr w:type="spellEnd"/>
+            <w:r>
+              <w:rPr>
+                <w:sz w:val="20"/>
+                <w:szCs w:val="20"/>
+              </w:rPr>
+              <w:t xml:space="preserve"> attack +50% miss</w:t>
             </w:r>
           </w:p>
         </w:tc>
@@ -13476,7 +14490,39 @@
       </w:pPr>
       <w:r>
         <w:lastRenderedPageBreak/>
-        <w:t>Sequences must be unique. The game validates the registry at startup and raises a configuration error if any two jutsu share the same sign_sequence tuple. Note that no sequence contains Ram, as Ram is permanently reserved as the Activation sign. Each jutsu also carries a cooldown_turns value in config, even though that field is not shown in this sample table.</w:t>
+        <w:t xml:space="preserve">Sequences must be unique. The game validates the registry at startup and raises a configuration error if any two </w:t>
+      </w:r>
+      <w:proofErr w:type="spellStart"/>
+      <w:r>
+        <w:t>jutsu</w:t>
+      </w:r>
+      <w:proofErr w:type="spellEnd"/>
+      <w:r>
+        <w:t xml:space="preserve"> share the same </w:t>
+      </w:r>
+      <w:proofErr w:type="spellStart"/>
+      <w:r>
+        <w:t>sign_sequence</w:t>
+      </w:r>
+      <w:proofErr w:type="spellEnd"/>
+      <w:r>
+        <w:t xml:space="preserve"> tuple. Note that no sequence contains Ram, as Ram is permanently reserved as the Activation sign. Each </w:t>
+      </w:r>
+      <w:proofErr w:type="spellStart"/>
+      <w:r>
+        <w:t>jutsu</w:t>
+      </w:r>
+      <w:proofErr w:type="spellEnd"/>
+      <w:r>
+        <w:t xml:space="preserve"> also carries a </w:t>
+      </w:r>
+      <w:proofErr w:type="spellStart"/>
+      <w:r>
+        <w:t>cooldown_turns</w:t>
+      </w:r>
+      <w:proofErr w:type="spellEnd"/>
+      <w:r>
+        <w:t xml:space="preserve"> value in config, even though that field is not shown in this sample table.</w:t>
       </w:r>
     </w:p>
     <w:p>
@@ -13513,7 +14559,15 @@
         <w:spacing w:before="60" w:after="100"/>
       </w:pPr>
       <w:r>
-        <w:t>The CV pipeline combines MediaPipe Hands for landmark detection with a student-trained CNN for sign classification. The division of responsibility is deliberate and academically defensible:</w:t>
+        <w:t xml:space="preserve">The CV pipeline combines </w:t>
+      </w:r>
+      <w:proofErr w:type="spellStart"/>
+      <w:r>
+        <w:t>MediaPipe</w:t>
+      </w:r>
+      <w:proofErr w:type="spellEnd"/>
+      <w:r>
+        <w:t xml:space="preserve"> Hands for landmark detection with a student-trained CNN for sign classification. The division of responsibility is deliberate and academically defensible:</w:t>
       </w:r>
     </w:p>
     <w:p>
@@ -13530,8 +14584,13 @@
         </w:numPr>
         <w:spacing w:before="40" w:after="40"/>
       </w:pPr>
-      <w:r>
-        <w:t>MediaPipe handles detection only: it finds the hands in the frame and returns 42 landmark points (21 per hand). This is standard industry tooling and is not the student's trained model.</w:t>
+      <w:proofErr w:type="spellStart"/>
+      <w:r>
+        <w:t>MediaPipe</w:t>
+      </w:r>
+      <w:proofErr w:type="spellEnd"/>
+      <w:r>
+        <w:t xml:space="preserve"> handles detection only: it finds the hands in the frame and returns 42 landmark points (21 per hand). This is standard industry tooling and is not the student's trained model.</w:t>
       </w:r>
     </w:p>
     <w:p>
@@ -13882,7 +14941,23 @@
                 <w:sz w:val="20"/>
                 <w:szCs w:val="20"/>
               </w:rPr>
-              <w:t>11 jutsu signs + Ram (Activation) + Scrap + Unknown</w:t>
+              <w:t xml:space="preserve">11 </w:t>
+            </w:r>
+            <w:proofErr w:type="spellStart"/>
+            <w:r>
+              <w:rPr>
+                <w:sz w:val="20"/>
+                <w:szCs w:val="20"/>
+              </w:rPr>
+              <w:t>jutsu</w:t>
+            </w:r>
+            <w:proofErr w:type="spellEnd"/>
+            <w:r>
+              <w:rPr>
+                <w:sz w:val="20"/>
+                <w:szCs w:val="20"/>
+              </w:rPr>
+              <w:t xml:space="preserve"> signs + Ram (Activation) + Scrap + Unknown</w:t>
             </w:r>
             <w:r>
               <w:rPr>
@@ -14237,7 +15312,15 @@
         <w:spacing w:before="60" w:after="100"/>
       </w:pPr>
       <w:r>
-        <w:t>The data_collector.py script shows a live webcam feed with a MediaPipe overlay. The developer presses a key to start recording samples for each sign class, naming each session by sign name. Collected landmarks are serialized to disk; the rendering to skeleton images happens offline during the training pipeline, not at collection time.</w:t>
+        <w:t xml:space="preserve">The data_collector.py script shows a live webcam feed with a </w:t>
+      </w:r>
+      <w:proofErr w:type="spellStart"/>
+      <w:r>
+        <w:t>MediaPipe</w:t>
+      </w:r>
+      <w:proofErr w:type="spellEnd"/>
+      <w:r>
+        <w:t xml:space="preserve"> overlay. The developer presses a key to start recording samples for each sign class, naming each session by sign name. Collected landmarks are serialized to disk; the rendering to skeleton images happens offline during the training pipeline, not at collection time.</w:t>
       </w:r>
     </w:p>
     <w:p>
@@ -14279,7 +15362,15 @@
       </w:pPr>
       <w:r>
         <w:lastRenderedPageBreak/>
-        <w:t>Hand Detection &amp; Landmark Extraction: MediaPipe Hands detects both hands and returns 42 (x, y, z) landmark coordinates in normalized image space.</w:t>
+        <w:t xml:space="preserve">Hand Detection &amp; Landmark Extraction: </w:t>
+      </w:r>
+      <w:proofErr w:type="spellStart"/>
+      <w:r>
+        <w:t>MediaPipe</w:t>
+      </w:r>
+      <w:proofErr w:type="spellEnd"/>
+      <w:r>
+        <w:t xml:space="preserve"> Hands detects both hands and returns 42 (x, y, z) landmark coordinates in normalized image space.</w:t>
       </w:r>
     </w:p>
     <w:p>
@@ -14318,7 +15409,15 @@
         <w:spacing w:before="40" w:after="60"/>
       </w:pPr>
       <w:r>
-        <w:t>Stability Confirmation: A sign is confirmed only when the CNN outputs the same class with confidence &gt;= 0.85 for 10 consecutive frames (~333 ms at 30 fps). Single-frame noise is absorbed, and the private buffer entry briefly locks in with a visual pulse.</w:t>
+        <w:t xml:space="preserve">Stability Confirmation: A sign is confirmed only when the CNN outputs the same class with confidence &gt;= 0.85 for 10 consecutive frames (~333 </w:t>
+      </w:r>
+      <w:proofErr w:type="spellStart"/>
+      <w:r>
+        <w:t>ms</w:t>
+      </w:r>
+      <w:proofErr w:type="spellEnd"/>
+      <w:r>
+        <w:t xml:space="preserve"> at 30 fps). Single-frame noise is absorbed, and the private buffer entry briefly locks in with a visual pulse.</w:t>
       </w:r>
     </w:p>
     <w:p>
@@ -14661,8 +15760,21 @@
               <w:t>Conv2d(3 -&gt; 32, kernel=3, padding=1)</w:t>
             </w:r>
             <w:r>
-              <w:t xml:space="preserve"> + BatchNorm + ReLU</w:t>
-            </w:r>
+              <w:t xml:space="preserve"> + </w:t>
+            </w:r>
+            <w:proofErr w:type="spellStart"/>
+            <w:r>
+              <w:t>BatchNorm</w:t>
+            </w:r>
+            <w:proofErr w:type="spellEnd"/>
+            <w:r>
+              <w:t xml:space="preserve"> + </w:t>
+            </w:r>
+            <w:proofErr w:type="spellStart"/>
+            <w:r>
+              <w:t>ReLU</w:t>
+            </w:r>
+            <w:proofErr w:type="spellEnd"/>
           </w:p>
         </w:tc>
         <w:tc>
@@ -14860,8 +15972,21 @@
               <w:t>Conv2d(32 -&gt; 64, kernel=3, padding=1)</w:t>
             </w:r>
             <w:r>
-              <w:t xml:space="preserve"> + BatchNorm + ReLU</w:t>
-            </w:r>
+              <w:t xml:space="preserve"> + </w:t>
+            </w:r>
+            <w:proofErr w:type="spellStart"/>
+            <w:r>
+              <w:t>BatchNorm</w:t>
+            </w:r>
+            <w:proofErr w:type="spellEnd"/>
+            <w:r>
+              <w:t xml:space="preserve"> + </w:t>
+            </w:r>
+            <w:proofErr w:type="spellStart"/>
+            <w:r>
+              <w:t>ReLU</w:t>
+            </w:r>
+            <w:proofErr w:type="spellEnd"/>
           </w:p>
         </w:tc>
         <w:tc>
@@ -15059,8 +16184,21 @@
               <w:t>Conv2d(64 -&gt; 128, kernel=3, padding=1)</w:t>
             </w:r>
             <w:r>
-              <w:t xml:space="preserve"> + BatchNorm + ReLU</w:t>
-            </w:r>
+              <w:t xml:space="preserve"> + </w:t>
+            </w:r>
+            <w:proofErr w:type="spellStart"/>
+            <w:r>
+              <w:t>BatchNorm</w:t>
+            </w:r>
+            <w:proofErr w:type="spellEnd"/>
+            <w:r>
+              <w:t xml:space="preserve"> + </w:t>
+            </w:r>
+            <w:proofErr w:type="spellStart"/>
+            <w:r>
+              <w:t>ReLU</w:t>
+            </w:r>
+            <w:proofErr w:type="spellEnd"/>
           </w:p>
         </w:tc>
         <w:tc>
@@ -15125,6 +16263,7 @@
             </w:tcMar>
           </w:tcPr>
           <w:p>
+            <w:proofErr w:type="spellStart"/>
             <w:r>
               <w:rPr>
                 <w:sz w:val="20"/>
@@ -15132,6 +16271,7 @@
               </w:rPr>
               <w:t>GlobalPool</w:t>
             </w:r>
+            <w:proofErr w:type="spellEnd"/>
           </w:p>
         </w:tc>
         <w:tc>
@@ -15353,7 +16493,15 @@
           </w:tcPr>
           <w:p>
             <w:r>
-              <w:t>Linear(2048 -&gt; 64) + ReLU + Dropout(0.3)</w:t>
+              <w:t xml:space="preserve">Linear(2048 -&gt; 64) + </w:t>
+            </w:r>
+            <w:proofErr w:type="spellStart"/>
+            <w:r>
+              <w:t>ReLU</w:t>
+            </w:r>
+            <w:proofErr w:type="spellEnd"/>
+            <w:r>
+              <w:t xml:space="preserve"> + Dropout(0.3)</w:t>
             </w:r>
           </w:p>
         </w:tc>
@@ -15453,8 +16601,13 @@
               <w:t>5</w:t>
             </w:r>
             <w:r>
-              <w:t>) + Softmax</w:t>
-            </w:r>
+              <w:t xml:space="preserve">) + </w:t>
+            </w:r>
+            <w:proofErr w:type="spellStart"/>
+            <w:r>
+              <w:t>Softmax</w:t>
+            </w:r>
+            <w:proofErr w:type="spellEnd"/>
           </w:p>
         </w:tc>
         <w:tc>
@@ -15506,7 +16659,23 @@
                 <w:sz w:val="20"/>
                 <w:szCs w:val="20"/>
               </w:rPr>
-              <w:t>11 jutsu + Ram(Act.) + Scrap + Unknown</w:t>
+              <w:t xml:space="preserve">11 </w:t>
+            </w:r>
+            <w:proofErr w:type="spellStart"/>
+            <w:r>
+              <w:rPr>
+                <w:sz w:val="20"/>
+                <w:szCs w:val="20"/>
+              </w:rPr>
+              <w:t>jutsu</w:t>
+            </w:r>
+            <w:proofErr w:type="spellEnd"/>
+            <w:r>
+              <w:rPr>
+                <w:sz w:val="20"/>
+                <w:szCs w:val="20"/>
+              </w:rPr>
+              <w:t xml:space="preserve"> + Ram(Act.) + Scrap + Unknown</w:t>
             </w:r>
             <w:r>
               <w:rPr>
@@ -15530,7 +16699,47 @@
       </w:pPr>
       <w:r>
         <w:lastRenderedPageBreak/>
-        <w:t>Framework: PyTorch. Loss: CrossEntropyLoss. Optimizer: Adam (lr=1e-3). LR Scheduler: StepLR (step_size=10, gamma=0.5). Approximate parameter count: ~1.6M. Expected training time: under 20 minutes on a laptop CPU with the recommended dataset.</w:t>
+        <w:t xml:space="preserve">Framework: </w:t>
+      </w:r>
+      <w:proofErr w:type="spellStart"/>
+      <w:r>
+        <w:t>PyTorch</w:t>
+      </w:r>
+      <w:proofErr w:type="spellEnd"/>
+      <w:r>
+        <w:t xml:space="preserve">. Loss: </w:t>
+      </w:r>
+      <w:proofErr w:type="spellStart"/>
+      <w:r>
+        <w:t>CrossEntropyLoss</w:t>
+      </w:r>
+      <w:proofErr w:type="spellEnd"/>
+      <w:r>
+        <w:t>. Optimizer: Adam (</w:t>
+      </w:r>
+      <w:proofErr w:type="spellStart"/>
+      <w:r>
+        <w:t>lr</w:t>
+      </w:r>
+      <w:proofErr w:type="spellEnd"/>
+      <w:r>
+        <w:t xml:space="preserve">=1e-3). LR Scheduler: </w:t>
+      </w:r>
+      <w:proofErr w:type="spellStart"/>
+      <w:r>
+        <w:t>StepLR</w:t>
+      </w:r>
+      <w:proofErr w:type="spellEnd"/>
+      <w:r>
+        <w:t xml:space="preserve"> (</w:t>
+      </w:r>
+      <w:proofErr w:type="spellStart"/>
+      <w:r>
+        <w:t>step_size</w:t>
+      </w:r>
+      <w:proofErr w:type="spellEnd"/>
+      <w:r>
+        <w:t>=10, gamma=0.5). Approximate parameter count: ~1.6M. Expected training time: under 20 minutes on a laptop CPU with the recommended dataset.</w:t>
       </w:r>
     </w:p>
     <w:p>
@@ -15713,7 +16922,15 @@
         <w:spacing w:before="60" w:after="100"/>
       </w:pPr>
       <w:r>
-        <w:t>Before a match begins, each player runs a local calibration screen in the React UI. This is NOT data collection; it is a live accuracy check using the already-trained model. The calibration screen shows: the player's webcam feed with the MediaPipe landmark overlay rendered in real time, the CNN's current top prediction and confidence percentage updated every frame, and a prompt to hold each sign for 3 seconds to verify the model recognizes it correctly on that player's specific hands and environment. Both players must confirm Ready before the match can start.</w:t>
+        <w:t xml:space="preserve">Before a match begins, each player runs a local calibration screen in the React UI. This is NOT data collection; it is a live accuracy check using the already-trained model. The calibration screen shows: the player's webcam feed with the </w:t>
+      </w:r>
+      <w:proofErr w:type="spellStart"/>
+      <w:r>
+        <w:t>MediaPipe</w:t>
+      </w:r>
+      <w:proofErr w:type="spellEnd"/>
+      <w:r>
+        <w:t xml:space="preserve"> landmark overlay rendered in real time, the CNN's current top prediction and confidence percentage updated every frame, and a prompt to hold each sign for 3 seconds to verify the model recognizes it correctly on that player's specific hands and environment. Both players must confirm Ready before the match can start.</w:t>
       </w:r>
     </w:p>
     <w:p>
@@ -15750,7 +16967,23 @@
         <w:spacing w:before="60" w:after="100"/>
       </w:pPr>
       <w:r>
-        <w:t>The game UI runs in a browser tab using React (Vite) rather than OpenCV windows or Pygame. This enables a polished, fully Naruto-themed interface with smooth animations that would be impractical to achieve in a desktop window UI.</w:t>
+        <w:t>The game UI runs in a browser tab using React (</w:t>
+      </w:r>
+      <w:proofErr w:type="spellStart"/>
+      <w:r>
+        <w:t>Vite</w:t>
+      </w:r>
+      <w:proofErr w:type="spellEnd"/>
+      <w:r>
+        <w:t xml:space="preserve">) rather than OpenCV windows or </w:t>
+      </w:r>
+      <w:proofErr w:type="spellStart"/>
+      <w:r>
+        <w:t>Pygame</w:t>
+      </w:r>
+      <w:proofErr w:type="spellEnd"/>
+      <w:r>
+        <w:t>. This enables a polished, fully Naruto-themed interface with smooth animations that would be impractical to achieve in a desktop window UI.</w:t>
       </w:r>
     </w:p>
     <w:p>
@@ -15929,8 +17162,17 @@
                 <w:sz w:val="20"/>
                 <w:szCs w:val="20"/>
               </w:rPr>
-              <w:t>React 18 + Vite</w:t>
-            </w:r>
+              <w:t xml:space="preserve">React 18 + </w:t>
+            </w:r>
+            <w:proofErr w:type="spellStart"/>
+            <w:r>
+              <w:rPr>
+                <w:sz w:val="20"/>
+                <w:szCs w:val="20"/>
+              </w:rPr>
+              <w:t>Vite</w:t>
+            </w:r>
+            <w:proofErr w:type="spellEnd"/>
           </w:p>
         </w:tc>
         <w:tc>
@@ -16095,7 +17337,23 @@
                 <w:sz w:val="20"/>
                 <w:szCs w:val="20"/>
               </w:rPr>
-              <w:t>Google Fonts: Cinzel / Noto Sans JP</w:t>
+              <w:t xml:space="preserve">Google Fonts: </w:t>
+            </w:r>
+            <w:proofErr w:type="spellStart"/>
+            <w:r>
+              <w:rPr>
+                <w:sz w:val="20"/>
+                <w:szCs w:val="20"/>
+              </w:rPr>
+              <w:t>Cinzel</w:t>
+            </w:r>
+            <w:proofErr w:type="spellEnd"/>
+            <w:r>
+              <w:rPr>
+                <w:sz w:val="20"/>
+                <w:szCs w:val="20"/>
+              </w:rPr>
+              <w:t xml:space="preserve"> / Noto Sans JP</w:t>
             </w:r>
           </w:p>
         </w:tc>
@@ -16117,12 +17375,21 @@
             </w:tcMar>
           </w:tcPr>
           <w:p>
-            <w:r>
-              <w:rPr>
-                <w:sz w:val="20"/>
-                <w:szCs w:val="20"/>
-              </w:rPr>
-              <w:t>Cinzel for headings (epic fantasy feel); Noto for body text</w:t>
+            <w:proofErr w:type="spellStart"/>
+            <w:r>
+              <w:rPr>
+                <w:sz w:val="20"/>
+                <w:szCs w:val="20"/>
+              </w:rPr>
+              <w:t>Cinzel</w:t>
+            </w:r>
+            <w:proofErr w:type="spellEnd"/>
+            <w:r>
+              <w:rPr>
+                <w:sz w:val="20"/>
+                <w:szCs w:val="20"/>
+              </w:rPr>
+              <w:t xml:space="preserve"> for headings (epic fantasy feel); Noto for body text</w:t>
             </w:r>
           </w:p>
         </w:tc>
@@ -16335,12 +17602,21 @@
             </w:tcMar>
           </w:tcPr>
           <w:p>
-            <w:r>
-              <w:rPr>
-                <w:sz w:val="20"/>
-                <w:szCs w:val="20"/>
-              </w:rPr>
-              <w:t>Navigator.mediaDevices (WebRTC)</w:t>
+            <w:proofErr w:type="spellStart"/>
+            <w:r>
+              <w:rPr>
+                <w:sz w:val="20"/>
+                <w:szCs w:val="20"/>
+              </w:rPr>
+              <w:t>Navigator.mediaDevices</w:t>
+            </w:r>
+            <w:proofErr w:type="spellEnd"/>
+            <w:r>
+              <w:rPr>
+                <w:sz w:val="20"/>
+                <w:szCs w:val="20"/>
+              </w:rPr>
+              <w:t xml:space="preserve"> (WebRTC)</w:t>
             </w:r>
           </w:p>
         </w:tc>
@@ -16419,8 +17695,33 @@
                 <w:sz w:val="20"/>
                 <w:szCs w:val="20"/>
               </w:rPr>
-              <w:t>React useState / useReducer</w:t>
-            </w:r>
+              <w:t xml:space="preserve">React </w:t>
+            </w:r>
+            <w:proofErr w:type="spellStart"/>
+            <w:r>
+              <w:rPr>
+                <w:sz w:val="20"/>
+                <w:szCs w:val="20"/>
+              </w:rPr>
+              <w:t>useState</w:t>
+            </w:r>
+            <w:proofErr w:type="spellEnd"/>
+            <w:r>
+              <w:rPr>
+                <w:sz w:val="20"/>
+                <w:szCs w:val="20"/>
+              </w:rPr>
+              <w:t xml:space="preserve"> / </w:t>
+            </w:r>
+            <w:proofErr w:type="spellStart"/>
+            <w:r>
+              <w:rPr>
+                <w:sz w:val="20"/>
+                <w:szCs w:val="20"/>
+              </w:rPr>
+              <w:t>useReducer</w:t>
+            </w:r>
+            <w:proofErr w:type="spellEnd"/>
           </w:p>
         </w:tc>
         <w:tc>
@@ -16994,7 +18295,15 @@
           </w:tcPr>
           <w:p>
             <w:r>
-              <w:t>Small buff/debuff badges with countdown.</w:t>
+              <w:t>Small buff/</w:t>
+            </w:r>
+            <w:proofErr w:type="spellStart"/>
+            <w:r>
+              <w:t>debuff</w:t>
+            </w:r>
+            <w:proofErr w:type="spellEnd"/>
+            <w:r>
+              <w:t xml:space="preserve"> badges with countdown.</w:t>
             </w:r>
           </w:p>
         </w:tc>
@@ -17364,7 +18673,23 @@
                 <w:sz w:val="20"/>
                 <w:szCs w:val="20"/>
               </w:rPr>
-              <w:t>Animated jutsu/action name; slides in for 2.5s after Activation</w:t>
+              <w:t xml:space="preserve">Animated </w:t>
+            </w:r>
+            <w:proofErr w:type="spellStart"/>
+            <w:r>
+              <w:rPr>
+                <w:sz w:val="20"/>
+                <w:szCs w:val="20"/>
+              </w:rPr>
+              <w:t>jutsu</w:t>
+            </w:r>
+            <w:proofErr w:type="spellEnd"/>
+            <w:r>
+              <w:rPr>
+                <w:sz w:val="20"/>
+                <w:szCs w:val="20"/>
+              </w:rPr>
+              <w:t>/action name; slides in for 2.5s after Activation</w:t>
             </w:r>
           </w:p>
         </w:tc>
@@ -17910,7 +19235,23 @@
                 <w:sz w:val="20"/>
                 <w:szCs w:val="20"/>
               </w:rPr>
-              <w:t>Colour-coded buff/debuff badges with turn countdown</w:t>
+              <w:t>Colour-coded buff/</w:t>
+            </w:r>
+            <w:proofErr w:type="spellStart"/>
+            <w:r>
+              <w:rPr>
+                <w:sz w:val="20"/>
+                <w:szCs w:val="20"/>
+              </w:rPr>
+              <w:t>debuff</w:t>
+            </w:r>
+            <w:proofErr w:type="spellEnd"/>
+            <w:r>
+              <w:rPr>
+                <w:sz w:val="20"/>
+                <w:szCs w:val="20"/>
+              </w:rPr>
+              <w:t xml:space="preserve"> badges with turn countdown</w:t>
             </w:r>
           </w:p>
         </w:tc>
@@ -18130,7 +19471,39 @@
                 <w:sz w:val="20"/>
                 <w:szCs w:val="20"/>
               </w:rPr>
-              <w:t>Scrolling log of last 3 actions, e.g. 'P1: Fireball Jutsu -&gt; 30 dmg'</w:t>
+              <w:t xml:space="preserve">Scrolling log of last 3 actions, </w:t>
+            </w:r>
+            <w:proofErr w:type="gramStart"/>
+            <w:r>
+              <w:rPr>
+                <w:sz w:val="20"/>
+                <w:szCs w:val="20"/>
+              </w:rPr>
+              <w:t>e.g.</w:t>
+            </w:r>
+            <w:proofErr w:type="gramEnd"/>
+            <w:r>
+              <w:rPr>
+                <w:sz w:val="20"/>
+                <w:szCs w:val="20"/>
+              </w:rPr>
+              <w:t xml:space="preserve"> 'P1: Fireball </w:t>
+            </w:r>
+            <w:proofErr w:type="spellStart"/>
+            <w:r>
+              <w:rPr>
+                <w:sz w:val="20"/>
+                <w:szCs w:val="20"/>
+              </w:rPr>
+              <w:t>Jutsu</w:t>
+            </w:r>
+            <w:proofErr w:type="spellEnd"/>
+            <w:r>
+              <w:rPr>
+                <w:sz w:val="20"/>
+                <w:szCs w:val="20"/>
+              </w:rPr>
+              <w:t xml:space="preserve"> -&gt; 30 dmg'</w:t>
             </w:r>
           </w:p>
         </w:tc>
@@ -18823,7 +20196,15 @@
         <w:spacing w:before="40" w:after="60"/>
       </w:pPr>
       <w:r>
-        <w:t>Splash / Lobby: Host and Join buttons. Host sees the ngrok URL to share. Guest pastes URL to connect.</w:t>
+        <w:t xml:space="preserve">Splash / Lobby: Host and Join buttons. Host sees the </w:t>
+      </w:r>
+      <w:proofErr w:type="spellStart"/>
+      <w:r>
+        <w:t>ngrok</w:t>
+      </w:r>
+      <w:proofErr w:type="spellEnd"/>
+      <w:r>
+        <w:t xml:space="preserve"> URL to share. Guest pastes URL to connect.</w:t>
       </w:r>
     </w:p>
     <w:p>
@@ -19065,7 +20446,23 @@
                 <w:sz w:val="20"/>
                 <w:szCs w:val="20"/>
               </w:rPr>
-              <w:t>Python + websockets library</w:t>
+              <w:t xml:space="preserve">Python + </w:t>
+            </w:r>
+            <w:proofErr w:type="spellStart"/>
+            <w:r>
+              <w:rPr>
+                <w:sz w:val="20"/>
+                <w:szCs w:val="20"/>
+              </w:rPr>
+              <w:t>websockets</w:t>
+            </w:r>
+            <w:proofErr w:type="spellEnd"/>
+            <w:r>
+              <w:rPr>
+                <w:sz w:val="20"/>
+                <w:szCs w:val="20"/>
+              </w:rPr>
+              <w:t xml:space="preserve"> library</w:t>
             </w:r>
           </w:p>
         </w:tc>
@@ -19092,7 +20489,23 @@
                 <w:sz w:val="20"/>
                 <w:szCs w:val="20"/>
               </w:rPr>
-              <w:t>Authoritative game state; all jutsu resolution runs here</w:t>
+              <w:t xml:space="preserve">Authoritative game state; all </w:t>
+            </w:r>
+            <w:proofErr w:type="spellStart"/>
+            <w:r>
+              <w:rPr>
+                <w:sz w:val="20"/>
+                <w:szCs w:val="20"/>
+              </w:rPr>
+              <w:t>jutsu</w:t>
+            </w:r>
+            <w:proofErr w:type="spellEnd"/>
+            <w:r>
+              <w:rPr>
+                <w:sz w:val="20"/>
+                <w:szCs w:val="20"/>
+              </w:rPr>
+              <w:t xml:space="preserve"> resolution runs here</w:t>
             </w:r>
           </w:p>
         </w:tc>
@@ -19250,7 +20663,15 @@
           </w:tcPr>
           <w:p>
             <w:r>
-              <w:t>Exposes the host's local WebSocket/signaling endpoint on a stable public URL</w:t>
+              <w:t>Exposes the host's local WebSocket/</w:t>
+            </w:r>
+            <w:proofErr w:type="spellStart"/>
+            <w:r>
+              <w:t>signaling</w:t>
+            </w:r>
+            <w:proofErr w:type="spellEnd"/>
+            <w:r>
+              <w:t xml:space="preserve"> endpoint on a stable public URL</w:t>
             </w:r>
           </w:p>
         </w:tc>
@@ -19306,7 +20727,23 @@
                 <w:sz w:val="20"/>
                 <w:szCs w:val="20"/>
               </w:rPr>
-              <w:t>React (Vite) in browser</w:t>
+              <w:t>React (</w:t>
+            </w:r>
+            <w:proofErr w:type="spellStart"/>
+            <w:r>
+              <w:rPr>
+                <w:sz w:val="20"/>
+                <w:szCs w:val="20"/>
+              </w:rPr>
+              <w:t>Vite</w:t>
+            </w:r>
+            <w:proofErr w:type="spellEnd"/>
+            <w:r>
+              <w:rPr>
+                <w:sz w:val="20"/>
+                <w:szCs w:val="20"/>
+              </w:rPr>
+              <w:t>) in browser</w:t>
             </w:r>
           </w:p>
         </w:tc>
@@ -19790,7 +21227,23 @@
                 <w:sz w:val="20"/>
                 <w:szCs w:val="20"/>
               </w:rPr>
-              <w:t>{ player_id, name }</w:t>
+              <w:t xml:space="preserve">{ </w:t>
+            </w:r>
+            <w:proofErr w:type="spellStart"/>
+            <w:r>
+              <w:rPr>
+                <w:sz w:val="20"/>
+                <w:szCs w:val="20"/>
+              </w:rPr>
+              <w:t>player_id</w:t>
+            </w:r>
+            <w:proofErr w:type="spellEnd"/>
+            <w:r>
+              <w:rPr>
+                <w:sz w:val="20"/>
+                <w:szCs w:val="20"/>
+              </w:rPr>
+              <w:t>, name }</w:t>
             </w:r>
           </w:p>
         </w:tc>
@@ -19861,7 +21314,31 @@
           </w:tcPr>
           <w:p>
             <w:r>
-              <w:t>{ player_id, sdp, ice_candidate }</w:t>
+              <w:t xml:space="preserve">{ </w:t>
+            </w:r>
+            <w:proofErr w:type="spellStart"/>
+            <w:r>
+              <w:t>player_id</w:t>
+            </w:r>
+            <w:proofErr w:type="spellEnd"/>
+            <w:r>
+              <w:t xml:space="preserve">, </w:t>
+            </w:r>
+            <w:proofErr w:type="spellStart"/>
+            <w:r>
+              <w:t>sdp</w:t>
+            </w:r>
+            <w:proofErr w:type="spellEnd"/>
+            <w:r>
+              <w:t xml:space="preserve">, </w:t>
+            </w:r>
+            <w:proofErr w:type="spellStart"/>
+            <w:r>
+              <w:t>ice_candidate</w:t>
+            </w:r>
+            <w:proofErr w:type="spellEnd"/>
+            <w:r>
+              <w:t xml:space="preserve"> }</w:t>
             </w:r>
           </w:p>
         </w:tc>
@@ -19940,7 +21417,39 @@
                 <w:sz w:val="20"/>
                 <w:szCs w:val="20"/>
               </w:rPr>
-              <w:t>{ player_id, sign_name, confidence, buffer }</w:t>
+              <w:t xml:space="preserve">{ </w:t>
+            </w:r>
+            <w:proofErr w:type="spellStart"/>
+            <w:r>
+              <w:rPr>
+                <w:sz w:val="20"/>
+                <w:szCs w:val="20"/>
+              </w:rPr>
+              <w:t>player_id</w:t>
+            </w:r>
+            <w:proofErr w:type="spellEnd"/>
+            <w:r>
+              <w:rPr>
+                <w:sz w:val="20"/>
+                <w:szCs w:val="20"/>
+              </w:rPr>
+              <w:t xml:space="preserve">, </w:t>
+            </w:r>
+            <w:proofErr w:type="spellStart"/>
+            <w:r>
+              <w:rPr>
+                <w:sz w:val="20"/>
+                <w:szCs w:val="20"/>
+              </w:rPr>
+              <w:t>sign_name</w:t>
+            </w:r>
+            <w:proofErr w:type="spellEnd"/>
+            <w:r>
+              <w:rPr>
+                <w:sz w:val="20"/>
+                <w:szCs w:val="20"/>
+              </w:rPr>
+              <w:t>, confidence, buffer }</w:t>
             </w:r>
           </w:p>
         </w:tc>
@@ -20019,7 +21528,39 @@
                 <w:sz w:val="20"/>
                 <w:szCs w:val="20"/>
               </w:rPr>
-              <w:t>{ player_id, sequence, resolved_action_type }</w:t>
+              <w:t xml:space="preserve">{ </w:t>
+            </w:r>
+            <w:proofErr w:type="spellStart"/>
+            <w:r>
+              <w:rPr>
+                <w:sz w:val="20"/>
+                <w:szCs w:val="20"/>
+              </w:rPr>
+              <w:t>player_id</w:t>
+            </w:r>
+            <w:proofErr w:type="spellEnd"/>
+            <w:r>
+              <w:rPr>
+                <w:sz w:val="20"/>
+                <w:szCs w:val="20"/>
+              </w:rPr>
+              <w:t xml:space="preserve">, sequence, </w:t>
+            </w:r>
+            <w:proofErr w:type="spellStart"/>
+            <w:r>
+              <w:rPr>
+                <w:sz w:val="20"/>
+                <w:szCs w:val="20"/>
+              </w:rPr>
+              <w:t>resolved_action_type</w:t>
+            </w:r>
+            <w:proofErr w:type="spellEnd"/>
+            <w:r>
+              <w:rPr>
+                <w:sz w:val="20"/>
+                <w:szCs w:val="20"/>
+              </w:rPr>
+              <w:t xml:space="preserve"> }</w:t>
             </w:r>
           </w:p>
         </w:tc>
@@ -20099,7 +21640,23 @@
                 <w:sz w:val="20"/>
                 <w:szCs w:val="20"/>
               </w:rPr>
-              <w:t>{ hp_p1, hp_p2, chakra_p1, chakra_p2, whose_turn, active_modifiers_p1, active_modifiers_p2 }</w:t>
+              <w:t xml:space="preserve">{ hp_p1, hp_p2, chakra_p1, chakra_p2, </w:t>
+            </w:r>
+            <w:proofErr w:type="spellStart"/>
+            <w:r>
+              <w:rPr>
+                <w:sz w:val="20"/>
+                <w:szCs w:val="20"/>
+              </w:rPr>
+              <w:t>whose_turn</w:t>
+            </w:r>
+            <w:proofErr w:type="spellEnd"/>
+            <w:r>
+              <w:rPr>
+                <w:sz w:val="20"/>
+                <w:szCs w:val="20"/>
+              </w:rPr>
+              <w:t>, active_modifiers_p1, active_modifiers_p2 }</w:t>
             </w:r>
           </w:p>
         </w:tc>
@@ -20178,7 +21735,103 @@
                 <w:sz w:val="20"/>
                 <w:szCs w:val="20"/>
               </w:rPr>
-              <w:t>{ action_name, hit, dmg_dealt, chakra_delta, status_effects, banner_text, regen_applied }</w:t>
+              <w:t xml:space="preserve">{ </w:t>
+            </w:r>
+            <w:proofErr w:type="spellStart"/>
+            <w:r>
+              <w:rPr>
+                <w:sz w:val="20"/>
+                <w:szCs w:val="20"/>
+              </w:rPr>
+              <w:t>action_name</w:t>
+            </w:r>
+            <w:proofErr w:type="spellEnd"/>
+            <w:r>
+              <w:rPr>
+                <w:sz w:val="20"/>
+                <w:szCs w:val="20"/>
+              </w:rPr>
+              <w:t xml:space="preserve">, hit, </w:t>
+            </w:r>
+            <w:proofErr w:type="spellStart"/>
+            <w:r>
+              <w:rPr>
+                <w:sz w:val="20"/>
+                <w:szCs w:val="20"/>
+              </w:rPr>
+              <w:t>dmg_dealt</w:t>
+            </w:r>
+            <w:proofErr w:type="spellEnd"/>
+            <w:r>
+              <w:rPr>
+                <w:sz w:val="20"/>
+                <w:szCs w:val="20"/>
+              </w:rPr>
+              <w:t xml:space="preserve">, </w:t>
+            </w:r>
+            <w:proofErr w:type="spellStart"/>
+            <w:r>
+              <w:rPr>
+                <w:sz w:val="20"/>
+                <w:szCs w:val="20"/>
+              </w:rPr>
+              <w:t>chakra_delta</w:t>
+            </w:r>
+            <w:proofErr w:type="spellEnd"/>
+            <w:r>
+              <w:rPr>
+                <w:sz w:val="20"/>
+                <w:szCs w:val="20"/>
+              </w:rPr>
+              <w:t xml:space="preserve">, </w:t>
+            </w:r>
+            <w:proofErr w:type="spellStart"/>
+            <w:r>
+              <w:rPr>
+                <w:sz w:val="20"/>
+                <w:szCs w:val="20"/>
+              </w:rPr>
+              <w:t>status_effects</w:t>
+            </w:r>
+            <w:proofErr w:type="spellEnd"/>
+            <w:r>
+              <w:rPr>
+                <w:sz w:val="20"/>
+                <w:szCs w:val="20"/>
+              </w:rPr>
+              <w:t xml:space="preserve">, </w:t>
+            </w:r>
+            <w:proofErr w:type="spellStart"/>
+            <w:r>
+              <w:rPr>
+                <w:sz w:val="20"/>
+                <w:szCs w:val="20"/>
+              </w:rPr>
+              <w:t>banner_text</w:t>
+            </w:r>
+            <w:proofErr w:type="spellEnd"/>
+            <w:r>
+              <w:rPr>
+                <w:sz w:val="20"/>
+                <w:szCs w:val="20"/>
+              </w:rPr>
+              <w:t xml:space="preserve">, </w:t>
+            </w:r>
+            <w:proofErr w:type="spellStart"/>
+            <w:r>
+              <w:rPr>
+                <w:sz w:val="20"/>
+                <w:szCs w:val="20"/>
+              </w:rPr>
+              <w:t>regen_applied</w:t>
+            </w:r>
+            <w:proofErr w:type="spellEnd"/>
+            <w:r>
+              <w:rPr>
+                <w:sz w:val="20"/>
+                <w:szCs w:val="20"/>
+              </w:rPr>
+              <w:t xml:space="preserve"> }</w:t>
             </w:r>
           </w:p>
         </w:tc>
@@ -20261,7 +21914,23 @@
                 <w:sz w:val="20"/>
                 <w:szCs w:val="20"/>
               </w:rPr>
-              <w:t>{ winner_id, final_hp_p1, final_hp_p2 }</w:t>
+              <w:t xml:space="preserve">{ </w:t>
+            </w:r>
+            <w:proofErr w:type="spellStart"/>
+            <w:r>
+              <w:rPr>
+                <w:sz w:val="20"/>
+                <w:szCs w:val="20"/>
+              </w:rPr>
+              <w:t>winner_id</w:t>
+            </w:r>
+            <w:proofErr w:type="spellEnd"/>
+            <w:r>
+              <w:rPr>
+                <w:sz w:val="20"/>
+                <w:szCs w:val="20"/>
+              </w:rPr>
+              <w:t>, final_hp_p1, final_hp_p2 }</w:t>
             </w:r>
           </w:p>
         </w:tc>
@@ -20360,7 +22029,15 @@
         <w:spacing w:before="60" w:after="100"/>
       </w:pPr>
       <w:r>
-        <w:t>The sign buffer is never transmitted to the server until the player activates. Only completed action intents are sent. This guarantees the opponent cannot observe the sequence being built. Actual video payloads use the WebRTC media channel; the server only relays signaling and game state.</w:t>
+        <w:t xml:space="preserve">The sign buffer is never transmitted to the server until the player activates. Only completed action intents are sent. This guarantees the opponent cannot observe the sequence being built. Actual video payloads use the WebRTC media channel; the server only relays </w:t>
+      </w:r>
+      <w:proofErr w:type="spellStart"/>
+      <w:r>
+        <w:t>signaling</w:t>
+      </w:r>
+      <w:proofErr w:type="spellEnd"/>
+      <w:r>
+        <w:t xml:space="preserve"> and game state.</w:t>
       </w:r>
     </w:p>
     <w:p>
@@ -20636,8 +22313,17 @@
                 <w:sz w:val="20"/>
                 <w:szCs w:val="20"/>
               </w:rPr>
-              <w:t>React 18 + Vite</w:t>
-            </w:r>
+              <w:t xml:space="preserve">React 18 + </w:t>
+            </w:r>
+            <w:proofErr w:type="spellStart"/>
+            <w:r>
+              <w:rPr>
+                <w:sz w:val="20"/>
+                <w:szCs w:val="20"/>
+              </w:rPr>
+              <w:t>Vite</w:t>
+            </w:r>
+            <w:proofErr w:type="spellEnd"/>
           </w:p>
         </w:tc>
         <w:tc>
@@ -20963,12 +22649,21 @@
             </w:tcMar>
           </w:tcPr>
           <w:p>
-            <w:r>
-              <w:rPr>
-                <w:sz w:val="20"/>
-                <w:szCs w:val="20"/>
-              </w:rPr>
-              <w:t>MediaPipe 0.10+</w:t>
+            <w:proofErr w:type="spellStart"/>
+            <w:r>
+              <w:rPr>
+                <w:sz w:val="20"/>
+                <w:szCs w:val="20"/>
+              </w:rPr>
+              <w:t>MediaPipe</w:t>
+            </w:r>
+            <w:proofErr w:type="spellEnd"/>
+            <w:r>
+              <w:rPr>
+                <w:sz w:val="20"/>
+                <w:szCs w:val="20"/>
+              </w:rPr>
+              <w:t xml:space="preserve"> 0.10+</w:t>
             </w:r>
           </w:p>
         </w:tc>
@@ -21129,12 +22824,21 @@
             </w:tcMar>
           </w:tcPr>
           <w:p>
-            <w:r>
-              <w:rPr>
-                <w:sz w:val="20"/>
-                <w:szCs w:val="20"/>
-              </w:rPr>
-              <w:t>PyTorch 2.x</w:t>
+            <w:proofErr w:type="spellStart"/>
+            <w:r>
+              <w:rPr>
+                <w:sz w:val="20"/>
+                <w:szCs w:val="20"/>
+              </w:rPr>
+              <w:t>PyTorch</w:t>
+            </w:r>
+            <w:proofErr w:type="spellEnd"/>
+            <w:r>
+              <w:rPr>
+                <w:sz w:val="20"/>
+                <w:szCs w:val="20"/>
+              </w:rPr>
+              <w:t xml:space="preserve"> 2.x</w:t>
             </w:r>
           </w:p>
         </w:tc>
@@ -21217,7 +22921,23 @@
                 <w:sz w:val="20"/>
                 <w:szCs w:val="20"/>
               </w:rPr>
-              <w:t>Python websockets library</w:t>
+              <w:t xml:space="preserve">Python </w:t>
+            </w:r>
+            <w:proofErr w:type="spellStart"/>
+            <w:r>
+              <w:rPr>
+                <w:sz w:val="20"/>
+                <w:szCs w:val="20"/>
+              </w:rPr>
+              <w:t>websockets</w:t>
+            </w:r>
+            <w:proofErr w:type="spellEnd"/>
+            <w:r>
+              <w:rPr>
+                <w:sz w:val="20"/>
+                <w:szCs w:val="20"/>
+              </w:rPr>
+              <w:t xml:space="preserve"> library</w:t>
             </w:r>
           </w:p>
         </w:tc>
@@ -21375,8 +23095,17 @@
                 <w:sz w:val="20"/>
                 <w:szCs w:val="20"/>
               </w:rPr>
-              <w:t>NumPy, torchvision</w:t>
-            </w:r>
+              <w:t xml:space="preserve">NumPy, </w:t>
+            </w:r>
+            <w:proofErr w:type="spellStart"/>
+            <w:r>
+              <w:rPr>
+                <w:sz w:val="20"/>
+                <w:szCs w:val="20"/>
+              </w:rPr>
+              <w:t>torchvision</w:t>
+            </w:r>
+            <w:proofErr w:type="spellEnd"/>
           </w:p>
         </w:tc>
         <w:tc>
@@ -21454,8 +23183,13 @@
           </w:tcPr>
           <w:p>
             <w:r>
-              <w:t>YAML config file + registry dict</w:t>
-            </w:r>
+              <w:t xml:space="preserve">YAML config file + registry </w:t>
+            </w:r>
+            <w:proofErr w:type="spellStart"/>
+            <w:r>
+              <w:t>dict</w:t>
+            </w:r>
+            <w:proofErr w:type="spellEnd"/>
           </w:p>
         </w:tc>
         <w:tc>
@@ -21477,7 +23211,15 @@
           </w:tcPr>
           <w:p>
             <w:r>
-              <w:t>Balance values, cooldowns, penalties, and jutsu metadata are editable without code changes</w:t>
+              <w:t xml:space="preserve">Balance values, cooldowns, penalties, and </w:t>
+            </w:r>
+            <w:proofErr w:type="spellStart"/>
+            <w:r>
+              <w:t>jutsu</w:t>
+            </w:r>
+            <w:proofErr w:type="spellEnd"/>
+            <w:r>
+              <w:t xml:space="preserve"> metadata are editable without code changes</w:t>
             </w:r>
           </w:p>
         </w:tc>
@@ -21528,12 +23270,21 @@
             </w:tcMar>
           </w:tcPr>
           <w:p>
-            <w:r>
-              <w:rPr>
-                <w:sz w:val="20"/>
-                <w:szCs w:val="20"/>
-              </w:rPr>
-              <w:t>PyTorch .pt checkpoint</w:t>
+            <w:proofErr w:type="spellStart"/>
+            <w:r>
+              <w:rPr>
+                <w:sz w:val="20"/>
+                <w:szCs w:val="20"/>
+              </w:rPr>
+              <w:t>PyTorch</w:t>
+            </w:r>
+            <w:proofErr w:type="spellEnd"/>
+            <w:r>
+              <w:rPr>
+                <w:sz w:val="20"/>
+                <w:szCs w:val="20"/>
+              </w:rPr>
+              <w:t xml:space="preserve"> .pt checkpoint</w:t>
             </w:r>
           </w:p>
         </w:tc>
@@ -21756,7 +23507,23 @@
                 <w:sz w:val="20"/>
                 <w:szCs w:val="20"/>
               </w:rPr>
-              <w:t>Trained CNN &gt;= 90% val accuracy</w:t>
+              <w:t xml:space="preserve">Trained CNN &gt;= 90% </w:t>
+            </w:r>
+            <w:proofErr w:type="spellStart"/>
+            <w:r>
+              <w:rPr>
+                <w:sz w:val="20"/>
+                <w:szCs w:val="20"/>
+              </w:rPr>
+              <w:t>val</w:t>
+            </w:r>
+            <w:proofErr w:type="spellEnd"/>
+            <w:r>
+              <w:rPr>
+                <w:sz w:val="20"/>
+                <w:szCs w:val="20"/>
+              </w:rPr>
+              <w:t xml:space="preserve"> accuracy</w:t>
             </w:r>
           </w:p>
         </w:tc>
@@ -21866,7 +23633,39 @@
                 <w:sz w:val="20"/>
                 <w:szCs w:val="20"/>
               </w:rPr>
-              <w:t>Turn engine, passive regen, jutsu registry, buff/debuff system, spam dampening, win condition; test with keyboard input</w:t>
+              <w:t xml:space="preserve">Turn engine, passive regen, </w:t>
+            </w:r>
+            <w:proofErr w:type="spellStart"/>
+            <w:r>
+              <w:rPr>
+                <w:sz w:val="20"/>
+                <w:szCs w:val="20"/>
+              </w:rPr>
+              <w:t>jutsu</w:t>
+            </w:r>
+            <w:proofErr w:type="spellEnd"/>
+            <w:r>
+              <w:rPr>
+                <w:sz w:val="20"/>
+                <w:szCs w:val="20"/>
+              </w:rPr>
+              <w:t xml:space="preserve"> registry, buff/</w:t>
+            </w:r>
+            <w:proofErr w:type="spellStart"/>
+            <w:r>
+              <w:rPr>
+                <w:sz w:val="20"/>
+                <w:szCs w:val="20"/>
+              </w:rPr>
+              <w:t>debuff</w:t>
+            </w:r>
+            <w:proofErr w:type="spellEnd"/>
+            <w:r>
+              <w:rPr>
+                <w:sz w:val="20"/>
+                <w:szCs w:val="20"/>
+              </w:rPr>
+              <w:t xml:space="preserve"> system, spam dampening, win condition; test with keyboard input</w:t>
             </w:r>
           </w:p>
         </w:tc>
@@ -22005,8 +23804,17 @@
                 <w:sz w:val="20"/>
                 <w:szCs w:val="20"/>
               </w:rPr>
-              <w:t>Two-machine online battle via ngrok</w:t>
-            </w:r>
+              <w:t xml:space="preserve">Two-machine online battle via </w:t>
+            </w:r>
+            <w:proofErr w:type="spellStart"/>
+            <w:r>
+              <w:rPr>
+                <w:sz w:val="20"/>
+                <w:szCs w:val="20"/>
+              </w:rPr>
+              <w:t>ngrok</w:t>
+            </w:r>
+            <w:proofErr w:type="spellEnd"/>
           </w:p>
         </w:tc>
         <w:tc>
@@ -22032,7 +23840,23 @@
                 <w:sz w:val="20"/>
                 <w:szCs w:val="20"/>
               </w:rPr>
-              <w:t>WebSocket server and client; video frame streaming; authoritative state sync; pyngrok auto-tunnel</w:t>
+              <w:t xml:space="preserve">WebSocket server and client; video frame streaming; authoritative state sync; </w:t>
+            </w:r>
+            <w:proofErr w:type="spellStart"/>
+            <w:r>
+              <w:rPr>
+                <w:sz w:val="20"/>
+                <w:szCs w:val="20"/>
+              </w:rPr>
+              <w:t>pyngrok</w:t>
+            </w:r>
+            <w:proofErr w:type="spellEnd"/>
+            <w:r>
+              <w:rPr>
+                <w:sz w:val="20"/>
+                <w:szCs w:val="20"/>
+              </w:rPr>
+              <w:t xml:space="preserve"> auto-tunnel</w:t>
             </w:r>
           </w:p>
         </w:tc>
@@ -22115,7 +23939,23 @@
                 <w:sz w:val="20"/>
                 <w:szCs w:val="20"/>
               </w:rPr>
-              <w:t>React + Vite + Tailwind setup; all HUD zones; Framer Motion banners; chakra bar glow animations; calibration screen in browser</w:t>
+              <w:t xml:space="preserve">React + </w:t>
+            </w:r>
+            <w:proofErr w:type="spellStart"/>
+            <w:r>
+              <w:rPr>
+                <w:sz w:val="20"/>
+                <w:szCs w:val="20"/>
+              </w:rPr>
+              <w:t>Vite</w:t>
+            </w:r>
+            <w:proofErr w:type="spellEnd"/>
+            <w:r>
+              <w:rPr>
+                <w:sz w:val="20"/>
+                <w:szCs w:val="20"/>
+              </w:rPr>
+              <w:t xml:space="preserve"> + Tailwind setup; all HUD zones; Framer Motion banners; chakra bar glow animations; calibration screen in browser</w:t>
             </w:r>
           </w:p>
         </w:tc>
@@ -22505,7 +24345,23 @@
                 <w:sz w:val="20"/>
                 <w:szCs w:val="20"/>
               </w:rPr>
-              <w:t>Visually similar signs confuse the CNN (e.g. Rat vs Ox, Hare vs Dragon)</w:t>
+              <w:t>Visually similar signs confuse the CNN (</w:t>
+            </w:r>
+            <w:proofErr w:type="gramStart"/>
+            <w:r>
+              <w:rPr>
+                <w:sz w:val="20"/>
+                <w:szCs w:val="20"/>
+              </w:rPr>
+              <w:t>e.g.</w:t>
+            </w:r>
+            <w:proofErr w:type="gramEnd"/>
+            <w:r>
+              <w:rPr>
+                <w:sz w:val="20"/>
+                <w:szCs w:val="20"/>
+              </w:rPr>
+              <w:t xml:space="preserve"> Rat vs Ox, Hare vs Dragon)</w:t>
             </w:r>
           </w:p>
         </w:tc>
@@ -22684,7 +24540,15 @@
           </w:tcPr>
           <w:p>
             <w:r>
-              <w:t>Tune jutsu chakra costs and cooldowns in config during Phase 6 playtesting if matches feel too long; reduce passive regen if needed</w:t>
+              <w:t xml:space="preserve">Tune </w:t>
+            </w:r>
+            <w:proofErr w:type="spellStart"/>
+            <w:r>
+              <w:t>jutsu</w:t>
+            </w:r>
+            <w:proofErr w:type="spellEnd"/>
+            <w:r>
+              <w:t xml:space="preserve"> chakra costs and cooldowns in config during Phase 6 playtesting if matches feel too long; reduce passive regen if needed</w:t>
             </w:r>
           </w:p>
         </w:tc>
@@ -22810,12 +24674,21 @@
             </w:tcMar>
           </w:tcPr>
           <w:p>
-            <w:r>
-              <w:rPr>
-                <w:sz w:val="20"/>
-                <w:szCs w:val="20"/>
-              </w:rPr>
-              <w:t>MediaPipe loses hand tracking mid-sequence</w:t>
+            <w:proofErr w:type="spellStart"/>
+            <w:r>
+              <w:rPr>
+                <w:sz w:val="20"/>
+                <w:szCs w:val="20"/>
+              </w:rPr>
+              <w:t>MediaPipe</w:t>
+            </w:r>
+            <w:proofErr w:type="spellEnd"/>
+            <w:r>
+              <w:rPr>
+                <w:sz w:val="20"/>
+                <w:szCs w:val="20"/>
+              </w:rPr>
+              <w:t xml:space="preserve"> loses hand tracking mid-sequence</w:t>
             </w:r>
           </w:p>
         </w:tc>
@@ -23112,7 +24985,23 @@
                 <w:sz w:val="20"/>
                 <w:szCs w:val="20"/>
               </w:rPr>
-              <w:t>Crossed-wrists pose is maximally distinct; Scrap uses 15 confirmation frames vs 10 for jutsu signs</w:t>
+              <w:t xml:space="preserve">Crossed-wrists pose is maximally distinct; Scrap uses 15 confirmation frames vs 10 for </w:t>
+            </w:r>
+            <w:proofErr w:type="spellStart"/>
+            <w:r>
+              <w:rPr>
+                <w:sz w:val="20"/>
+                <w:szCs w:val="20"/>
+              </w:rPr>
+              <w:t>jutsu</w:t>
+            </w:r>
+            <w:proofErr w:type="spellEnd"/>
+            <w:r>
+              <w:rPr>
+                <w:sz w:val="20"/>
+                <w:szCs w:val="20"/>
+              </w:rPr>
+              <w:t xml:space="preserve"> signs</w:t>
             </w:r>
           </w:p>
         </w:tc>
@@ -23276,7 +25165,23 @@
                 <w:sz w:val="20"/>
                 <w:szCs w:val="20"/>
               </w:rPr>
-              <w:t>The Ram hand sign, reserved as the token that finalizes the sequence buffer and submits it to the game engine. Never used in any jutsu sequence.</w:t>
+              <w:t xml:space="preserve">The Ram hand sign, reserved as the token that finalizes the sequence buffer and submits it to the game engine. Never used in any </w:t>
+            </w:r>
+            <w:proofErr w:type="spellStart"/>
+            <w:r>
+              <w:rPr>
+                <w:sz w:val="20"/>
+                <w:szCs w:val="20"/>
+              </w:rPr>
+              <w:t>jutsu</w:t>
+            </w:r>
+            <w:proofErr w:type="spellEnd"/>
+            <w:r>
+              <w:rPr>
+                <w:sz w:val="20"/>
+                <w:szCs w:val="20"/>
+              </w:rPr>
+              <w:t xml:space="preserve"> sequence.</w:t>
             </w:r>
           </w:p>
         </w:tc>
@@ -23384,7 +25289,23 @@
           </w:tcPr>
           <w:p>
             <w:r>
-              <w:t>The in-game resource consumed by jutsu; regenerates +10 passively each turn start and an additional +20 on Focus turns; cannot exceed Max Chakra or go below 0</w:t>
+              <w:t xml:space="preserve">The in-game resource consumed by </w:t>
+            </w:r>
+            <w:proofErr w:type="spellStart"/>
+            <w:r>
+              <w:t>jutsu</w:t>
+            </w:r>
+            <w:proofErr w:type="spellEnd"/>
+            <w:r>
+              <w:t xml:space="preserve">; regenerates +10 passively each turn </w:t>
+            </w:r>
+            <w:proofErr w:type="gramStart"/>
+            <w:r>
+              <w:t>start</w:t>
+            </w:r>
+            <w:proofErr w:type="gramEnd"/>
+            <w:r>
+              <w:t xml:space="preserve"> and an additional +20 on Focus turns; cannot exceed Max Chakra or go below 0</w:t>
             </w:r>
           </w:p>
         </w:tc>
@@ -23464,6 +25385,7 @@
             </w:tcMar>
           </w:tcPr>
           <w:p>
+            <w:proofErr w:type="spellStart"/>
             <w:r>
               <w:rPr>
                 <w:sz w:val="20"/>
@@ -23471,6 +25393,7 @@
               </w:rPr>
               <w:t>Debuff</w:t>
             </w:r>
+            <w:proofErr w:type="spellEnd"/>
           </w:p>
         </w:tc>
         <w:tc>
@@ -23572,6 +25495,7 @@
             </w:tcMar>
           </w:tcPr>
           <w:p>
+            <w:proofErr w:type="spellStart"/>
             <w:r>
               <w:rPr>
                 <w:sz w:val="20"/>
@@ -23579,6 +25503,7 @@
               </w:rPr>
               <w:t>Jutsu</w:t>
             </w:r>
+            <w:proofErr w:type="spellEnd"/>
           </w:p>
         </w:tc>
         <w:tc>
@@ -23628,12 +25553,21 @@
             </w:tcMar>
           </w:tcPr>
           <w:p>
-            <w:r>
-              <w:rPr>
-                <w:sz w:val="20"/>
-                <w:szCs w:val="20"/>
-              </w:rPr>
-              <w:t>Jutsu Registry</w:t>
+            <w:proofErr w:type="spellStart"/>
+            <w:r>
+              <w:rPr>
+                <w:sz w:val="20"/>
+                <w:szCs w:val="20"/>
+              </w:rPr>
+              <w:t>Jutsu</w:t>
+            </w:r>
+            <w:proofErr w:type="spellEnd"/>
+            <w:r>
+              <w:rPr>
+                <w:sz w:val="20"/>
+                <w:szCs w:val="20"/>
+              </w:rPr>
+              <w:t xml:space="preserve"> Registry</w:t>
             </w:r>
           </w:p>
         </w:tc>
@@ -23660,7 +25594,23 @@
                 <w:sz w:val="20"/>
                 <w:szCs w:val="20"/>
               </w:rPr>
-              <w:t>The dictionary mapping sign-sequence tuples to jutsu stat objects; validated for uniqueness at startup</w:t>
+              <w:t xml:space="preserve">The dictionary mapping sign-sequence tuples to </w:t>
+            </w:r>
+            <w:proofErr w:type="spellStart"/>
+            <w:r>
+              <w:rPr>
+                <w:sz w:val="20"/>
+                <w:szCs w:val="20"/>
+              </w:rPr>
+              <w:t>jutsu</w:t>
+            </w:r>
+            <w:proofErr w:type="spellEnd"/>
+            <w:r>
+              <w:rPr>
+                <w:sz w:val="20"/>
+                <w:szCs w:val="20"/>
+              </w:rPr>
+              <w:t xml:space="preserve"> stat objects; validated for uniqueness at startup</w:t>
             </w:r>
           </w:p>
         </w:tc>
@@ -23716,7 +25666,39 @@
                 <w:sz w:val="20"/>
                 <w:szCs w:val="20"/>
               </w:rPr>
-              <w:t>One of 21 keypoints (x, y, z) extracted per hand by MediaPipe; 42 total for two-handed signs</w:t>
+              <w:t xml:space="preserve">One of 21 </w:t>
+            </w:r>
+            <w:proofErr w:type="spellStart"/>
+            <w:r>
+              <w:rPr>
+                <w:sz w:val="20"/>
+                <w:szCs w:val="20"/>
+              </w:rPr>
+              <w:t>keypoints</w:t>
+            </w:r>
+            <w:proofErr w:type="spellEnd"/>
+            <w:r>
+              <w:rPr>
+                <w:sz w:val="20"/>
+                <w:szCs w:val="20"/>
+              </w:rPr>
+              <w:t xml:space="preserve"> (x, y, z) extracted per hand by </w:t>
+            </w:r>
+            <w:proofErr w:type="spellStart"/>
+            <w:r>
+              <w:rPr>
+                <w:sz w:val="20"/>
+                <w:szCs w:val="20"/>
+              </w:rPr>
+              <w:t>MediaPipe</w:t>
+            </w:r>
+            <w:proofErr w:type="spellEnd"/>
+            <w:r>
+              <w:rPr>
+                <w:sz w:val="20"/>
+                <w:szCs w:val="20"/>
+              </w:rPr>
+              <w:t>; 42 total for two-handed signs</w:t>
             </w:r>
           </w:p>
         </w:tc>
@@ -23740,6 +25722,7 @@
             </w:tcMar>
           </w:tcPr>
           <w:p>
+            <w:proofErr w:type="spellStart"/>
             <w:r>
               <w:rPr>
                 <w:sz w:val="20"/>
@@ -23747,6 +25730,7 @@
               </w:rPr>
               <w:t>MediaPipe</w:t>
             </w:r>
+            <w:proofErr w:type="spellEnd"/>
           </w:p>
         </w:tc>
         <w:tc>
@@ -23828,7 +25812,39 @@
                 <w:sz w:val="20"/>
                 <w:szCs w:val="20"/>
               </w:rPr>
-              <w:t>A random outcome based on miss_rate that causes a jutsu to have no effect despite a valid cast</w:t>
+              <w:t xml:space="preserve">A random outcome based on </w:t>
+            </w:r>
+            <w:proofErr w:type="spellStart"/>
+            <w:r>
+              <w:rPr>
+                <w:sz w:val="20"/>
+                <w:szCs w:val="20"/>
+              </w:rPr>
+              <w:t>miss_rate</w:t>
+            </w:r>
+            <w:proofErr w:type="spellEnd"/>
+            <w:r>
+              <w:rPr>
+                <w:sz w:val="20"/>
+                <w:szCs w:val="20"/>
+              </w:rPr>
+              <w:t xml:space="preserve"> that causes a </w:t>
+            </w:r>
+            <w:proofErr w:type="spellStart"/>
+            <w:r>
+              <w:rPr>
+                <w:sz w:val="20"/>
+                <w:szCs w:val="20"/>
+              </w:rPr>
+              <w:t>jutsu</w:t>
+            </w:r>
+            <w:proofErr w:type="spellEnd"/>
+            <w:r>
+              <w:rPr>
+                <w:sz w:val="20"/>
+                <w:szCs w:val="20"/>
+              </w:rPr>
+              <w:t xml:space="preserve"> to have no effect despite a valid cast</w:t>
             </w:r>
           </w:p>
         </w:tc>
@@ -24021,8 +26037,17 @@
                 <w:sz w:val="20"/>
                 <w:szCs w:val="20"/>
               </w:rPr>
-              <w:t>Shadow Clone Jutsu</w:t>
-            </w:r>
+              <w:t xml:space="preserve">Shadow Clone </w:t>
+            </w:r>
+            <w:proofErr w:type="spellStart"/>
+            <w:r>
+              <w:rPr>
+                <w:sz w:val="20"/>
+                <w:szCs w:val="20"/>
+              </w:rPr>
+              <w:t>Jutsu</w:t>
+            </w:r>
+            <w:proofErr w:type="spellEnd"/>
           </w:p>
         </w:tc>
         <w:tc>
@@ -24104,7 +26129,23 @@
                 <w:sz w:val="20"/>
                 <w:szCs w:val="20"/>
               </w:rPr>
-              <w:t>The 128x128 grayscale rendering of MediaPipe landmarks used as CNN input</w:t>
+              <w:t xml:space="preserve">The 128x128 grayscale rendering of </w:t>
+            </w:r>
+            <w:proofErr w:type="spellStart"/>
+            <w:r>
+              <w:rPr>
+                <w:sz w:val="20"/>
+                <w:szCs w:val="20"/>
+              </w:rPr>
+              <w:t>MediaPipe</w:t>
+            </w:r>
+            <w:proofErr w:type="spellEnd"/>
+            <w:r>
+              <w:rPr>
+                <w:sz w:val="20"/>
+                <w:szCs w:val="20"/>
+              </w:rPr>
+              <w:t xml:space="preserve"> landmarks used as CNN input</w:t>
             </w:r>
           </w:p>
         </w:tc>
@@ -24160,7 +26201,23 @@
                 <w:sz w:val="20"/>
                 <w:szCs w:val="20"/>
               </w:rPr>
-              <w:t>Damage reduction applied when the same attack jutsu is used on consecutive turns</w:t>
+              <w:t xml:space="preserve">Damage reduction applied when the same attack </w:t>
+            </w:r>
+            <w:proofErr w:type="spellStart"/>
+            <w:r>
+              <w:rPr>
+                <w:sz w:val="20"/>
+                <w:szCs w:val="20"/>
+              </w:rPr>
+              <w:t>jutsu</w:t>
+            </w:r>
+            <w:proofErr w:type="spellEnd"/>
+            <w:r>
+              <w:rPr>
+                <w:sz w:val="20"/>
+                <w:szCs w:val="20"/>
+              </w:rPr>
+              <w:t xml:space="preserve"> is used on consecutive turns</w:t>
             </w:r>
           </w:p>
         </w:tc>

</xml_diff>